<commit_message>
docs: mark flagged thesis assumptions as confirmed by student
The Khoá/Ngành inference and the IEEE-vs-biểu-mẫu reference format
choice (Phụ lục C) were confirmed correct by the student; update the
wording from open questions to confirmed decisions.

Co-Authored-By: Claude Sonnet 5 <noreply@anthropic.com>
Claude-Session: https://claude.ai/code/session_012MsmdJyXAipgvwuSTidUDk
</commit_message>
<xml_diff>
--- a/thesis/doc/thesis.docx
+++ b/thesis/doc/thesis.docx
@@ -14305,7 +14305,7 @@
           <w:color w:val="000000"/>
           <w:sz w:val="28"/>
         </w:rPr>
-        <w:t>Phụ lục C. Ghi chú minh bạch và các giả định cần xác nhận</w:t>
+        <w:t>Phụ lục C. Ghi chú minh bạch về phương pháp luận</w:t>
       </w:r>
     </w:p>
     <w:p>
@@ -14375,7 +14375,7 @@
           <w:i w:val="0"/>
           <w:sz w:val="26"/>
         </w:rPr>
-        <w:t>"Khoá: 2023" và "Ngành: Công nghệ thông tin" trên bìa và trên hai bản nhận xét mẫu là suy luận hợp lý nhất từ mã lớp "DX23TT11" và tên khoa "KHOA CÔNG NGHỆ THÔNG TIN" — chưa có nguồn xác nhận trực tiếp, cần sinh viên xác nhận lại trước khi nộp chính thức.</w:t>
+        <w:t>"Khoá: 2023" và "Ngành: Công nghệ thông tin" trên bìa và trên hai bản nhận xét mẫu được suy luận từ mã lớp "DX23TT11" và tên khoa "KHOA CÔNG NGHỆ THÔNG TIN", và đã được sinh viên xác nhận là chính xác.</w:t>
       </w:r>
     </w:p>
     <w:p>
@@ -14389,7 +14389,7 @@
           <w:i w:val="0"/>
           <w:sz w:val="26"/>
         </w:rPr>
-        <w:t>Biểu mẫu trình bày chính thức của trường quy định danh mục tài liệu tham khảo theo kiểu tác giả-năm (xếp theo abc họ/tên tác giả, tách "Tiếng Việt"/"Tiếng Anh"), khác với định dạng IEEE đánh số [1]-[21] mà đề cương chi tiết đã duyệt của đồ án này yêu cầu rõ ràng (mục 12 đề cương: "đánh số [1] đến [21]... theo định dạng IEEE"). Đây là hai nguồn tài liệu mâu thuẫn nhau về quy tắc này. Báo cáo GIỮ NGUYÊN định dạng IEEE theo đúng đề cương đã duyệt riêng cho đồ án này (phù hợp hơn với lĩnh vực công nghệ thông tin, và ví dụ tham khảo trong biểu mẫu chung của trường — về "lúa lai", kinh tế — cho thấy biểu mẫu đó vốn dùng chung cho nhiều ngành khác nhau, không chuyên biệt cho ngành công nghệ thông tin). Đề nghị sinh viên/giảng viên hướng dẫn xác nhận lại lựa chọn này trước khi nộp chính thức.</w:t>
+        <w:t>Biểu mẫu trình bày chính thức của trường quy định danh mục tài liệu tham khảo theo kiểu tác giả-năm (xếp theo abc họ/tên tác giả, tách "Tiếng Việt"/"Tiếng Anh"), khác với định dạng IEEE đánh số [1]-[21] mà đề cương chi tiết đã duyệt của đồ án này yêu cầu rõ ràng (mục 12 đề cương: "đánh số [1] đến [21]... theo định dạng IEEE"). Đây là hai nguồn tài liệu mâu thuẫn nhau về quy tắc này. Báo cáo GIỮ NGUYÊN định dạng IEEE theo đúng đề cương đã duyệt riêng cho đồ án này (phù hợp hơn với lĩnh vực công nghệ thông tin, và ví dụ tham khảo trong biểu mẫu chung của trường — về "lúa lai", kinh tế — cho thấy biểu mẫu đó vốn dùng chung cho nhiều ngành khác nhau, không chuyên biệt cho ngành công nghệ thông tin). Sinh viên đã xác nhận giữ định dạng IEEE theo đề cương chi tiết đã duyệt.</w:t>
       </w:r>
     </w:p>
     <w:p>

</xml_diff>

<commit_message>
docs: remove ABSTRACT section, not required by the official biểu mẫu
The English Abstract duplicating Tóm tắt Đồ án was an extra addition on
top of the official Trường Đại học Trà Vinh template, which only asks
for a Vietnamese Tóm tắt. Removed at the student's request; re-measured
and updated the mục lục Roman-numeral page numbers for the front matter
(Chương 1 onward is unaffected since Arabic numbering restarts at 1
there regardless of front-matter length).

Co-Authored-By: Claude Sonnet 5 <noreply@anthropic.com>
Claude-Session: https://claude.ai/code/session_012MsmdJyXAipgvwuSTidUDk
</commit_message>
<xml_diff>
--- a/thesis/doc/thesis.docx
+++ b/thesis/doc/thesis.docx
@@ -546,96 +546,6 @@
           <w:color w:val="000000"/>
           <w:sz w:val="32"/>
         </w:rPr>
-        <w:t>ABSTRACT</w:t>
-      </w:r>
-    </w:p>
-    <w:p>
-      <w:pPr>
-        <w:jc w:val="both"/>
-      </w:pPr>
-      <w:r>
-        <w:rPr>
-          <w:rFonts w:ascii="Times New Roman" w:hAnsi="Times New Roman"/>
-          <w:b w:val="0"/>
-          <w:i w:val="0"/>
-          <w:sz w:val="26"/>
-        </w:rPr>
-        <w:t>This project builds an offline handwritten signature verification system following a writer-independent approach, using a Siamese neural network trained with contrastive loss, as proposed in the approved project outline. Two model configurations are trained and compared: Configuration A, a 5-block Conv-BatchNorm-ReLU-MaxPool convolutional network trained from scratch, and Configuration B, a transfer-learning model built on an ImageNet-pretrained ResNet18 backbone fine-tuned in two stages. A handcrafted-feature baseline (HOG features with an RBF-kernel SVM) is also built for comparison.</w:t>
-      </w:r>
-    </w:p>
-    <w:p>
-      <w:pPr>
-        <w:jc w:val="both"/>
-      </w:pPr>
-      <w:r>
-        <w:rPr>
-          <w:rFonts w:ascii="Times New Roman" w:hAnsi="Times New Roman"/>
-          <w:b w:val="0"/>
-          <w:i w:val="0"/>
-          <w:sz w:val="26"/>
-        </w:rPr>
-        <w:t>Experiments use the CEDAR dataset (55 writers, split writer-disjointly 40/5/10 for train/validation/test) for in-domain training, and the BHSig260 dataset (Bengali and Hindi signatures) for zero-shot cross-domain generalization -- the threshold τ selected on the CEDAR validation split by the Equal Error Rate (EER) criterion is frozen and applied as-is, with no fine-tuning, to avoid leaking information into threshold selection.</w:t>
-      </w:r>
-    </w:p>
-    <w:p>
-      <w:pPr>
-        <w:jc w:val="both"/>
-      </w:pPr>
-      <w:r>
-        <w:rPr>
-          <w:rFonts w:ascii="Times New Roman" w:hAnsi="Times New Roman"/>
-          <w:b w:val="0"/>
-          <w:i w:val="0"/>
-          <w:sz w:val="26"/>
-        </w:rPr>
-        <w:t>Real (not simulated) results on the CEDAR test split: Configuration B reaches an overall AUC of 0.955 (validation EER 5.50%), outperforming Configuration A (AUC 0.915, EER 9.75%) and the HOG+SVM baseline (AUC 0.887); FAR on random forgeries drops from 39.5% to 13.0%. Zero-shot evaluation on BHSig260 shows the model retains meaningful discriminative signal across a different script/language domain (AUC 0.75-0.85).</w:t>
-      </w:r>
-    </w:p>
-    <w:p>
-      <w:pPr>
-        <w:jc w:val="both"/>
-      </w:pPr>
-      <w:r>
-        <w:rPr>
-          <w:rFonts w:ascii="Times New Roman" w:hAnsi="Times New Roman"/>
-          <w:b w:val="0"/>
-          <w:i w:val="0"/>
-          <w:sz w:val="26"/>
-        </w:rPr>
-        <w:t>Of the eight experiments (T1-T8) planned in the outline, T1 (baseline), T2 (Configuration A), T3 (Configuration B) and T7 (cross-dataset check) are completed in full; T5 is partially completed (margin sweep done, augmentation on/off not separately tested); T4, T6 and T8 were not carried out given time/hardware constraints, and are reported honestly as future work. An interactive Streamlit demo application, processing images entirely in memory, is built using the trained Configuration B model.</w:t>
-      </w:r>
-    </w:p>
-    <w:p>
-      <w:pPr>
-        <w:jc w:val="both"/>
-      </w:pPr>
-      <w:r>
-        <w:rPr>
-          <w:rFonts w:ascii="Times New Roman" w:hAnsi="Times New Roman"/>
-          <w:b w:val="0"/>
-          <w:i/>
-          <w:sz w:val="26"/>
-        </w:rPr>
-        <w:t>Keywords: offline signature verification, Siamese network, contrastive loss, transfer learning, ResNet18, writer-independent, CEDAR, BHSig260.</w:t>
-      </w:r>
-    </w:p>
-    <w:p>
-      <w:r>
-        <w:br w:type="page"/>
-      </w:r>
-    </w:p>
-    <w:p>
-      <w:pPr>
-        <w:pStyle w:val="Heading1"/>
-        <w:jc w:val="center"/>
-      </w:pPr>
-      <w:r>
-        <w:rPr>
-          <w:rFonts w:ascii="Times New Roman" w:hAnsi="Times New Roman"/>
-          <w:b/>
-          <w:color w:val="000000"/>
-          <w:sz w:val="32"/>
-        </w:rPr>
         <w:t>MỤC LỤC</w:t>
       </w:r>
     </w:p>
@@ -654,7 +564,7 @@
         </w:rPr>
         <w:t>LỜI MỞ ĐẦU</w:t>
         <w:tab/>
-        <w:t>ix</w:t>
+        <w:t>viii</w:t>
       </w:r>
     </w:p>
     <w:p>
@@ -673,7 +583,7 @@
         </w:rPr>
         <w:t>1. Lý do chọn đề tài</w:t>
         <w:tab/>
-        <w:t>ix</w:t>
+        <w:t>viii</w:t>
       </w:r>
     </w:p>
     <w:p>
@@ -692,7 +602,7 @@
         </w:rPr>
         <w:t>2. Mục tiêu nghiên cứu</w:t>
         <w:tab/>
-        <w:t>x</w:t>
+        <w:t>ix</w:t>
       </w:r>
     </w:p>
     <w:p>
@@ -711,7 +621,7 @@
         </w:rPr>
         <w:t>3. Đối tượng và phạm vi nghiên cứu</w:t>
         <w:tab/>
-        <w:t>x</w:t>
+        <w:t>ix</w:t>
       </w:r>
     </w:p>
     <w:p>
@@ -730,7 +640,7 @@
         </w:rPr>
         <w:t>4. Phương pháp nghiên cứu</w:t>
         <w:tab/>
-        <w:t>xii</w:t>
+        <w:t>xi</w:t>
       </w:r>
     </w:p>
     <w:p>
@@ -749,7 +659,7 @@
         </w:rPr>
         <w:t>5. Cấu trúc báo cáo</w:t>
         <w:tab/>
-        <w:t>xii</w:t>
+        <w:t>xi</w:t>
       </w:r>
     </w:p>
     <w:p>

</xml_diff>

<commit_message>
fix: break thesis cover title at a clean phrase boundary
The title's first line ("...CHỮ KÝ VIẾT TAY OFFLINE") was too long for
one line at this font size and auto-wrapped mid-phrase, splitting
"VIẾT" onto one line and "TAY OFFLINE" onto the next -- looked like a
typo/wrong title since "viết tay" (handwritten) got torn apart. Now
explicitly broken into 3 lines at phrase boundaries: "...XÁC MINH CHỮ
KÝ" / "VIẾT TAY OFFLINE" / "SỬ DỤNG MẠNG NƠ-RON SIAMESE".

(Verified the "Lớp"/"Mã số sinh viên"/"Khoá" lines the student also
flagged are genuinely center-aligned in the raw XML (<w:jc
w:val="center"/>) -- no separate bug there; the short auto-wrapped
"TAY OFFLINE" line likely just looked off-center next to it.)

Co-Authored-By: Claude Sonnet 5 <noreply@anthropic.com>
Claude-Session: https://claude.ai/code/session_012MsmdJyXAipgvwuSTidUDk
</commit_message>
<xml_diff>
--- a/thesis/doc/thesis.docx
+++ b/thesis/doc/thesis.docx
@@ -113,7 +113,9 @@
           <w:i w:val="0"/>
           <w:sz w:val="36"/>
         </w:rPr>
-        <w:t>XÂY DỰNG HỆ THỐNG XÁC MINH CHỮ KÝ VIẾT TAY OFFLINE</w:t>
+        <w:t>XÂY DỰNG HỆ THỐNG XÁC MINH CHỮ KÝ</w:t>
+        <w:br/>
+        <w:t>VIẾT TAY OFFLINE</w:t>
         <w:br/>
         <w:t>SỬ DỤNG MẠNG NƠ-RON SIAMESE</w:t>
       </w:r>
@@ -355,7 +357,9 @@
           <w:i w:val="0"/>
           <w:sz w:val="36"/>
         </w:rPr>
-        <w:t>XÂY DỰNG HỆ THỐNG XÁC MINH CHỮ KÝ VIẾT TAY OFFLINE</w:t>
+        <w:t>XÂY DỰNG HỆ THỐNG XÁC MINH CHỮ KÝ</w:t>
+        <w:br/>
+        <w:t>VIẾT TAY OFFLINE</w:t>
         <w:br/>
         <w:t>SỬ DỤNG MẠNG NƠ-RON SIAMESE</w:t>
       </w:r>

</xml_diff>

<commit_message>
fix: left-align the Giảng viên/Sinh viên info block on the cover page
Checked the official template's raw XML directly: those 5 lines have
no explicit alignment or indent set at all (python-docx reports
alignment=None, left_indent=None), meaning they just use the Normal
style's default -- left. The centered look in the previous version was
wrong; left-aligning them (while keeping the headers/title/date
centered, matching the template there too) now matches the source
document exactly.

Co-Authored-By: Claude Sonnet 5 <noreply@anthropic.com>
Claude-Session: https://claude.ai/code/session_012MsmdJyXAipgvwuSTidUDk
</commit_message>
<xml_diff>
--- a/thesis/doc/thesis.docx
+++ b/thesis/doc/thesis.docx
@@ -124,9 +124,6 @@
     <w:p/>
     <w:p/>
     <w:p>
-      <w:pPr>
-        <w:jc w:val="center"/>
-      </w:pPr>
       <w:r>
         <w:rPr>
           <w:rFonts w:ascii="Times New Roman" w:hAnsi="Times New Roman"/>
@@ -147,7 +144,6 @@
     <w:p>
       <w:pPr>
         <w:spacing w:after="0"/>
-        <w:jc w:val="both"/>
       </w:pPr>
       <w:r>
         <w:rPr>
@@ -159,9 +155,6 @@
       </w:r>
     </w:p>
     <w:p>
-      <w:pPr>
-        <w:jc w:val="center"/>
-      </w:pPr>
       <w:r>
         <w:rPr>
           <w:rFonts w:ascii="Times New Roman" w:hAnsi="Times New Roman"/>
@@ -182,7 +175,6 @@
     <w:p>
       <w:pPr>
         <w:spacing w:after="0"/>
-        <w:jc w:val="center"/>
       </w:pPr>
       <w:r>
         <w:rPr>
@@ -197,7 +189,6 @@
     <w:p>
       <w:pPr>
         <w:spacing w:after="0"/>
-        <w:jc w:val="center"/>
       </w:pPr>
       <w:r>
         <w:rPr>
@@ -212,7 +203,6 @@
     <w:p>
       <w:pPr>
         <w:spacing w:after="0"/>
-        <w:jc w:val="center"/>
       </w:pPr>
       <w:r>
         <w:rPr>
@@ -368,9 +358,6 @@
     <w:p/>
     <w:p/>
     <w:p>
-      <w:pPr>
-        <w:jc w:val="center"/>
-      </w:pPr>
       <w:r>
         <w:rPr>
           <w:rFonts w:ascii="Times New Roman" w:hAnsi="Times New Roman"/>
@@ -391,7 +378,6 @@
     <w:p>
       <w:pPr>
         <w:spacing w:after="0"/>
-        <w:jc w:val="both"/>
       </w:pPr>
       <w:r>
         <w:rPr>
@@ -403,9 +389,6 @@
       </w:r>
     </w:p>
     <w:p>
-      <w:pPr>
-        <w:jc w:val="center"/>
-      </w:pPr>
       <w:r>
         <w:rPr>
           <w:rFonts w:ascii="Times New Roman" w:hAnsi="Times New Roman"/>
@@ -426,7 +409,6 @@
     <w:p>
       <w:pPr>
         <w:spacing w:after="0"/>
-        <w:jc w:val="center"/>
       </w:pPr>
       <w:r>
         <w:rPr>
@@ -441,7 +423,6 @@
     <w:p>
       <w:pPr>
         <w:spacing w:after="0"/>
-        <w:jc w:val="center"/>
       </w:pPr>
       <w:r>
         <w:rPr>
@@ -456,7 +437,6 @@
     <w:p>
       <w:pPr>
         <w:spacing w:after="0"/>
-        <w:jc w:val="center"/>
       </w:pPr>
       <w:r>
         <w:rPr>

</xml_diff>

<commit_message>
feat: nâng nội dung lên 43 trang, chỉnh style bìa theo mẫu tham khảo
Thêm thực nghiệm đường cong học thật (KNN theo kích thước tập huấn luyện
1.000-54.000 mẫu) làm mục 4.10 mới, đẩy nội dung chính (MỞ ĐẦU + 5 chương,
không tính bìa/cảm ơn/mục lục/TLTK) từ 41 lên 43 trang, tổng 62 trang.

Chỉnh style trang bìa theo mẫu tham khảo: bỏ khoảng trắng trước dấu hai
chấm, nhãn chữ thường + giá trị in đậm (thay vì cả nhãn và giá trị đều
đậm), logo lớn hơn (3.5cm), Khoá hiển thị dạng khoảng "2023–2027". Tên
sinh viên/giảng viên/trường vẫn giữ nguyên đúng thông tin thật.

Mục lục hội tụ chính xác (0/57 mục lệch số trang).

Co-Authored-By: Claude Sonnet 5 <noreply@anthropic.com>
Claude-Session: https://claude.ai/code/session_012MsmdJyXAipgvwuSTidUDk
</commit_message>
<xml_diff>
--- a/thesis/doc/thesis.docx
+++ b/thesis/doc/thesis.docx
@@ -54,7 +54,7 @@
       <w:r>
         <w:drawing>
           <wp:inline xmlns:a="http://schemas.openxmlformats.org/drawingml/2006/main" xmlns:pic="http://schemas.openxmlformats.org/drawingml/2006/picture">
-            <wp:extent cx="792000" cy="792000"/>
+            <wp:extent cx="1260000" cy="1260000"/>
             <wp:docPr id="1" name="Picture 1"/>
             <wp:cNvGraphicFramePr>
               <a:graphicFrameLocks noChangeAspect="1"/>
@@ -75,7 +75,7 @@
                   <pic:spPr>
                     <a:xfrm>
                       <a:off x="0" y="0"/>
-                      <a:ext cx="792000" cy="792000"/>
+                      <a:ext cx="1260000" cy="1260000"/>
                     </a:xfrm>
                     <a:prstGeom prst="rect"/>
                   </pic:spPr>
@@ -122,15 +122,14 @@
     </w:p>
     <w:p/>
     <w:p/>
-    <w:p/>
-    <w:p>
-      <w:r>
-        <w:rPr>
-          <w:rFonts w:ascii="Times New Roman" w:hAnsi="Times New Roman"/>
-          <w:b/>
+    <w:p>
+      <w:r>
+        <w:rPr>
+          <w:rFonts w:ascii="Times New Roman" w:hAnsi="Times New Roman"/>
+          <w:b w:val="0"/>
           <w:sz w:val="28"/>
         </w:rPr>
-        <w:t xml:space="preserve">Giảng viên hướng dẫn : </w:t>
+        <w:t xml:space="preserve">Giảng viên hướng dẫn: </w:t>
       </w:r>
       <w:r>
         <w:rPr>
@@ -158,10 +157,28 @@
       <w:r>
         <w:rPr>
           <w:rFonts w:ascii="Times New Roman" w:hAnsi="Times New Roman"/>
+          <w:b w:val="0"/>
+          <w:sz w:val="28"/>
+        </w:rPr>
+        <w:t xml:space="preserve">Sinh viên thực hiện: </w:t>
+      </w:r>
+      <w:r>
+        <w:rPr>
+          <w:rFonts w:ascii="Times New Roman" w:hAnsi="Times New Roman"/>
           <w:b/>
           <w:sz w:val="28"/>
         </w:rPr>
-        <w:t xml:space="preserve">Sinh viên thực hiện: </w:t>
+        <w:t>PHAN THÀNH THUẬN</w:t>
+      </w:r>
+    </w:p>
+    <w:p>
+      <w:r>
+        <w:rPr>
+          <w:rFonts w:ascii="Times New Roman" w:hAnsi="Times New Roman"/>
+          <w:b w:val="0"/>
+          <w:sz w:val="28"/>
+        </w:rPr>
+        <w:t xml:space="preserve">Mã số sinh viên: </w:t>
       </w:r>
       <w:r>
         <w:rPr>
@@ -169,12 +186,100 @@
           <w:b/>
           <w:sz w:val="28"/>
         </w:rPr>
-        <w:t>PHAN THÀNH THUẬN</w:t>
+        <w:t>170123591</w:t>
+      </w:r>
+    </w:p>
+    <w:p>
+      <w:r>
+        <w:rPr>
+          <w:rFonts w:ascii="Times New Roman" w:hAnsi="Times New Roman"/>
+          <w:b w:val="0"/>
+          <w:sz w:val="28"/>
+        </w:rPr>
+        <w:t xml:space="preserve">Lớp: </w:t>
+      </w:r>
+      <w:r>
+        <w:rPr>
+          <w:rFonts w:ascii="Times New Roman" w:hAnsi="Times New Roman"/>
+          <w:b/>
+          <w:sz w:val="28"/>
+        </w:rPr>
+        <w:t>DX23TT11</w:t>
+      </w:r>
+    </w:p>
+    <w:p>
+      <w:r>
+        <w:rPr>
+          <w:rFonts w:ascii="Times New Roman" w:hAnsi="Times New Roman"/>
+          <w:b w:val="0"/>
+          <w:sz w:val="28"/>
+        </w:rPr>
+        <w:t xml:space="preserve">Khoá: </w:t>
+      </w:r>
+      <w:r>
+        <w:rPr>
+          <w:rFonts w:ascii="Times New Roman" w:hAnsi="Times New Roman"/>
+          <w:b/>
+          <w:sz w:val="28"/>
+        </w:rPr>
+        <w:t>2023–2027</w:t>
+      </w:r>
+    </w:p>
+    <w:p/>
+    <w:p/>
+    <w:p>
+      <w:pPr>
+        <w:jc w:val="center"/>
+      </w:pPr>
+      <w:r>
+        <w:rPr>
+          <w:rFonts w:ascii="Times New Roman" w:hAnsi="Times New Roman"/>
+          <w:b/>
+          <w:i w:val="0"/>
+          <w:sz w:val="26"/>
+        </w:rPr>
+        <w:t>Trà Vinh, tháng 10 năm 2026</w:t>
+      </w:r>
+    </w:p>
+    <w:p>
+      <w:r>
+        <w:br w:type="page"/>
       </w:r>
     </w:p>
     <w:p>
       <w:pPr>
         <w:spacing w:after="0"/>
+        <w:jc w:val="center"/>
+      </w:pPr>
+      <w:r>
+        <w:rPr>
+          <w:rFonts w:ascii="Times New Roman" w:hAnsi="Times New Roman"/>
+          <w:b/>
+          <w:i w:val="0"/>
+          <w:sz w:val="32"/>
+        </w:rPr>
+        <w:t>TRƯỜNG ĐẠI HỌC TRÀ VINH</w:t>
+      </w:r>
+    </w:p>
+    <w:p>
+      <w:pPr>
+        <w:spacing w:after="0"/>
+        <w:jc w:val="center"/>
+      </w:pPr>
+      <w:r>
+        <w:rPr>
+          <w:rFonts w:ascii="Times New Roman" w:hAnsi="Times New Roman"/>
+          <w:b/>
+          <w:i w:val="0"/>
+          <w:sz w:val="32"/>
+        </w:rPr>
+        <w:t>TRƯỜNG KỸ THUẬT VÀ CÔNG NGHỆ</w:t>
+      </w:r>
+    </w:p>
+    <w:p>
+      <w:pPr>
+        <w:spacing w:after="0"/>
+        <w:jc w:val="center"/>
       </w:pPr>
       <w:r>
         <w:rPr>
@@ -183,101 +288,6 @@
           <w:i w:val="0"/>
           <w:sz w:val="28"/>
         </w:rPr>
-        <w:t>Mã số sinh viên : 170123591</w:t>
-      </w:r>
-    </w:p>
-    <w:p>
-      <w:pPr>
-        <w:spacing w:after="0"/>
-      </w:pPr>
-      <w:r>
-        <w:rPr>
-          <w:rFonts w:ascii="Times New Roman" w:hAnsi="Times New Roman"/>
-          <w:b/>
-          <w:i w:val="0"/>
-          <w:sz w:val="28"/>
-        </w:rPr>
-        <w:t>Lớp : DX23TT11</w:t>
-      </w:r>
-    </w:p>
-    <w:p>
-      <w:pPr>
-        <w:spacing w:after="0"/>
-      </w:pPr>
-      <w:r>
-        <w:rPr>
-          <w:rFonts w:ascii="Times New Roman" w:hAnsi="Times New Roman"/>
-          <w:b/>
-          <w:i w:val="0"/>
-          <w:sz w:val="28"/>
-        </w:rPr>
-        <w:t>Khoá : 2023</w:t>
-      </w:r>
-    </w:p>
-    <w:p/>
-    <w:p/>
-    <w:p/>
-    <w:p>
-      <w:pPr>
-        <w:jc w:val="center"/>
-      </w:pPr>
-      <w:r>
-        <w:rPr>
-          <w:rFonts w:ascii="Times New Roman" w:hAnsi="Times New Roman"/>
-          <w:b/>
-          <w:i w:val="0"/>
-          <w:sz w:val="26"/>
-        </w:rPr>
-        <w:t>Trà Vinh, tháng 10 năm 2026</w:t>
-      </w:r>
-    </w:p>
-    <w:p>
-      <w:r>
-        <w:br w:type="page"/>
-      </w:r>
-    </w:p>
-    <w:p>
-      <w:pPr>
-        <w:spacing w:after="0"/>
-        <w:jc w:val="center"/>
-      </w:pPr>
-      <w:r>
-        <w:rPr>
-          <w:rFonts w:ascii="Times New Roman" w:hAnsi="Times New Roman"/>
-          <w:b/>
-          <w:i w:val="0"/>
-          <w:sz w:val="32"/>
-        </w:rPr>
-        <w:t>TRƯỜNG ĐẠI HỌC TRÀ VINH</w:t>
-      </w:r>
-    </w:p>
-    <w:p>
-      <w:pPr>
-        <w:spacing w:after="0"/>
-        <w:jc w:val="center"/>
-      </w:pPr>
-      <w:r>
-        <w:rPr>
-          <w:rFonts w:ascii="Times New Roman" w:hAnsi="Times New Roman"/>
-          <w:b/>
-          <w:i w:val="0"/>
-          <w:sz w:val="32"/>
-        </w:rPr>
-        <w:t>TRƯỜNG KỸ THUẬT VÀ CÔNG NGHỆ</w:t>
-      </w:r>
-    </w:p>
-    <w:p>
-      <w:pPr>
-        <w:spacing w:after="0"/>
-        <w:jc w:val="center"/>
-      </w:pPr>
-      <w:r>
-        <w:rPr>
-          <w:rFonts w:ascii="Times New Roman" w:hAnsi="Times New Roman"/>
-          <w:b/>
-          <w:i w:val="0"/>
-          <w:sz w:val="28"/>
-        </w:rPr>
         <w:t>KHOA CÔNG NGHỆ THÔNG TIN</w:t>
       </w:r>
     </w:p>
@@ -288,7 +298,7 @@
       <w:r>
         <w:drawing>
           <wp:inline xmlns:a="http://schemas.openxmlformats.org/drawingml/2006/main" xmlns:pic="http://schemas.openxmlformats.org/drawingml/2006/picture">
-            <wp:extent cx="792000" cy="792000"/>
+            <wp:extent cx="1260000" cy="1260000"/>
             <wp:docPr id="2" name="Picture 2"/>
             <wp:cNvGraphicFramePr>
               <a:graphicFrameLocks noChangeAspect="1"/>
@@ -309,7 +319,7 @@
                   <pic:spPr>
                     <a:xfrm>
                       <a:off x="0" y="0"/>
-                      <a:ext cx="792000" cy="792000"/>
+                      <a:ext cx="1260000" cy="1260000"/>
                     </a:xfrm>
                     <a:prstGeom prst="rect"/>
                   </pic:spPr>
@@ -356,15 +366,14 @@
     </w:p>
     <w:p/>
     <w:p/>
-    <w:p/>
-    <w:p>
-      <w:r>
-        <w:rPr>
-          <w:rFonts w:ascii="Times New Roman" w:hAnsi="Times New Roman"/>
-          <w:b/>
+    <w:p>
+      <w:r>
+        <w:rPr>
+          <w:rFonts w:ascii="Times New Roman" w:hAnsi="Times New Roman"/>
+          <w:b w:val="0"/>
           <w:sz w:val="28"/>
         </w:rPr>
-        <w:t xml:space="preserve">Giảng viên hướng dẫn : </w:t>
+        <w:t xml:space="preserve">Giảng viên hướng dẫn: </w:t>
       </w:r>
       <w:r>
         <w:rPr>
@@ -392,10 +401,28 @@
       <w:r>
         <w:rPr>
           <w:rFonts w:ascii="Times New Roman" w:hAnsi="Times New Roman"/>
+          <w:b w:val="0"/>
+          <w:sz w:val="28"/>
+        </w:rPr>
+        <w:t xml:space="preserve">Sinh viên thực hiện: </w:t>
+      </w:r>
+      <w:r>
+        <w:rPr>
+          <w:rFonts w:ascii="Times New Roman" w:hAnsi="Times New Roman"/>
           <w:b/>
           <w:sz w:val="28"/>
         </w:rPr>
-        <w:t xml:space="preserve">Sinh viên thực hiện: </w:t>
+        <w:t>PHAN THÀNH THUẬN</w:t>
+      </w:r>
+    </w:p>
+    <w:p>
+      <w:r>
+        <w:rPr>
+          <w:rFonts w:ascii="Times New Roman" w:hAnsi="Times New Roman"/>
+          <w:b w:val="0"/>
+          <w:sz w:val="28"/>
+        </w:rPr>
+        <w:t xml:space="preserve">Mã số sinh viên: </w:t>
       </w:r>
       <w:r>
         <w:rPr>
@@ -403,52 +430,45 @@
           <w:b/>
           <w:sz w:val="28"/>
         </w:rPr>
-        <w:t>PHAN THÀNH THUẬN</w:t>
-      </w:r>
-    </w:p>
-    <w:p>
-      <w:pPr>
-        <w:spacing w:after="0"/>
-      </w:pPr>
+        <w:t>170123591</w:t>
+      </w:r>
+    </w:p>
+    <w:p>
+      <w:r>
+        <w:rPr>
+          <w:rFonts w:ascii="Times New Roman" w:hAnsi="Times New Roman"/>
+          <w:b w:val="0"/>
+          <w:sz w:val="28"/>
+        </w:rPr>
+        <w:t xml:space="preserve">Lớp: </w:t>
+      </w:r>
       <w:r>
         <w:rPr>
           <w:rFonts w:ascii="Times New Roman" w:hAnsi="Times New Roman"/>
           <w:b/>
-          <w:i w:val="0"/>
           <w:sz w:val="28"/>
         </w:rPr>
-        <w:t>Mã số sinh viên : 170123591</w:t>
-      </w:r>
-    </w:p>
-    <w:p>
-      <w:pPr>
-        <w:spacing w:after="0"/>
-      </w:pPr>
+        <w:t>DX23TT11</w:t>
+      </w:r>
+    </w:p>
+    <w:p>
+      <w:r>
+        <w:rPr>
+          <w:rFonts w:ascii="Times New Roman" w:hAnsi="Times New Roman"/>
+          <w:b w:val="0"/>
+          <w:sz w:val="28"/>
+        </w:rPr>
+        <w:t xml:space="preserve">Khoá: </w:t>
+      </w:r>
       <w:r>
         <w:rPr>
           <w:rFonts w:ascii="Times New Roman" w:hAnsi="Times New Roman"/>
           <w:b/>
-          <w:i w:val="0"/>
           <w:sz w:val="28"/>
         </w:rPr>
-        <w:t>Lớp : DX23TT11</w:t>
-      </w:r>
-    </w:p>
-    <w:p>
-      <w:pPr>
-        <w:spacing w:after="0"/>
-      </w:pPr>
-      <w:r>
-        <w:rPr>
-          <w:rFonts w:ascii="Times New Roman" w:hAnsi="Times New Roman"/>
-          <w:b/>
-          <w:i w:val="0"/>
-          <w:sz w:val="28"/>
-        </w:rPr>
-        <w:t>Khoá : 2023</w:t>
-      </w:r>
-    </w:p>
-    <w:p/>
+        <w:t>2023–2027</w:t>
+      </w:r>
+    </w:p>
     <w:p/>
     <w:p/>
     <w:p>
@@ -1501,7 +1521,7 @@
           <w:b w:val="0"/>
           <w:sz w:val="24"/>
         </w:rPr>
-        <w:t>4.10. Phân tích định tính các ca lỗi</w:t>
+        <w:t>4.10. Đường cong học theo kích thước tập huấn luyện</w:t>
         <w:tab/>
         <w:t>33</w:t>
       </w:r>
@@ -1520,9 +1540,9 @@
           <w:b w:val="0"/>
           <w:sz w:val="24"/>
         </w:rPr>
-        <w:t>4.11. Kết quả chương trình demo</w:t>
+        <w:t>4.11. Phân tích định tính các ca lỗi</w:t>
         <w:tab/>
-        <w:t>33</w:t>
+        <w:t>34</w:t>
       </w:r>
     </w:p>
     <w:p>
@@ -1539,7 +1559,7 @@
           <w:b w:val="0"/>
           <w:sz w:val="24"/>
         </w:rPr>
-        <w:t>4.12. Hạn chế của chương trình demo</w:t>
+        <w:t>4.12. Kết quả chương trình demo</w:t>
         <w:tab/>
         <w:t>35</w:t>
       </w:r>
@@ -1558,9 +1578,9 @@
           <w:b w:val="0"/>
           <w:sz w:val="24"/>
         </w:rPr>
-        <w:t>4.13. Thảo luận tổng hợp</w:t>
+        <w:t>4.13. Hạn chế của chương trình demo</w:t>
         <w:tab/>
-        <w:t>35</w:t>
+        <w:t>36</w:t>
       </w:r>
     </w:p>
     <w:p>
@@ -1569,14 +1589,15 @@
           <w:tab w:pos="9071" w:val="right" w:leader="dot"/>
         </w:tabs>
         <w:spacing w:after="80" w:before="0" w:line="240" w:lineRule="auto"/>
-      </w:pPr>
-      <w:r>
-        <w:rPr>
-          <w:rFonts w:ascii="Times New Roman" w:hAnsi="Times New Roman"/>
-          <w:b/>
-          <w:sz w:val="26"/>
-        </w:rPr>
-        <w:t>CHƯƠNG 5. KẾT LUẬN VÀ HƯỚNG PHÁT TRIỂN</w:t>
+        <w:ind w:left="397"/>
+      </w:pPr>
+      <w:r>
+        <w:rPr>
+          <w:rFonts w:ascii="Times New Roman" w:hAnsi="Times New Roman"/>
+          <w:b w:val="0"/>
+          <w:sz w:val="24"/>
+        </w:rPr>
+        <w:t>4.14. Thảo luận tổng hợp</w:t>
         <w:tab/>
         <w:t>36</w:t>
       </w:r>
@@ -1594,7 +1615,7 @@
           <w:b/>
           <w:sz w:val="26"/>
         </w:rPr>
-        <w:t>DANH MỤC TÀI LIỆU THAM KHẢO</w:t>
+        <w:t>CHƯƠNG 5. KẾT LUẬN VÀ HƯỚNG PHÁT TRIỂN</w:t>
         <w:tab/>
         <w:t>38</w:t>
       </w:r>
@@ -1612,9 +1633,27 @@
           <w:b/>
           <w:sz w:val="26"/>
         </w:rPr>
+        <w:t>DANH MỤC TÀI LIỆU THAM KHẢO</w:t>
+        <w:tab/>
+        <w:t>40</w:t>
+      </w:r>
+    </w:p>
+    <w:p>
+      <w:pPr>
+        <w:tabs>
+          <w:tab w:pos="9071" w:val="right" w:leader="dot"/>
+        </w:tabs>
+        <w:spacing w:after="80" w:before="0" w:line="240" w:lineRule="auto"/>
+      </w:pPr>
+      <w:r>
+        <w:rPr>
+          <w:rFonts w:ascii="Times New Roman" w:hAnsi="Times New Roman"/>
+          <w:b/>
+          <w:sz w:val="26"/>
+        </w:rPr>
         <w:t>PHỤ LỤC</w:t>
         <w:tab/>
-        <w:t>40</w:t>
+        <w:t>42</w:t>
       </w:r>
     </w:p>
     <w:p>
@@ -2852,7 +2891,7 @@
         <w:t>Ngành: Công nghệ thông tin</w:t>
         <w:tab/>
         <w:tab/>
-        <w:t>Khoá: 2023</w:t>
+        <w:t>Khoá: 2023–2027</w:t>
       </w:r>
     </w:p>
     <w:p>
@@ -8624,7 +8663,7 @@
           <w:i w:val="0"/>
           <w:sz w:val="26"/>
         </w:rPr>
-        <w:t>Như trình bày ở mục 3.3, dữ liệu MNIST thật (70.000 ảnh) được chia stratify thành 54.000 ảnh huấn luyện, 6.000 ảnh kiểm định và 10.000 ảnh kiểm thử. Các mục 4.2, 4.6, 4.8, 4.9, 4.10 báo cáo số liệu trên tập kiểm thử (hoàn toàn chưa được mô hình nhìn thấy); các mục 4.3-4.5 khảo sát ảnh hưởng tham số trên tập kiểm định, theo đúng nguyên tắc tránh rò rỉ dữ liệu đã nêu ở mục 2.4.</w:t>
+        <w:t>Như trình bày ở mục 3.3, dữ liệu MNIST thật (70.000 ảnh) được chia stratify thành 54.000 ảnh huấn luyện, 6.000 ảnh kiểm định và 10.000 ảnh kiểm thử. Các mục 4.2, 4.6, 4.8, 4.9, 4.11 báo cáo số liệu trên tập kiểm thử (hoàn toàn chưa được mô hình nhìn thấy); các mục 4.3-4.5 và 4.10 khảo sát ảnh hưởng tham số/kích thước dữ liệu trên tập kiểm định, theo đúng nguyên tắc tránh rò rỉ dữ liệu đã nêu ở mục 2.4.</w:t>
       </w:r>
     </w:p>
     <w:p>
@@ -12256,7 +12295,7 @@
           <w:color w:val="000000"/>
           <w:sz w:val="28"/>
         </w:rPr>
-        <w:t>4.10. Phân tích định tính các ca lỗi</w:t>
+        <w:t>4.10. Đường cong học theo kích thước tập huấn luyện</w:t>
       </w:r>
     </w:p>
     <w:p>
@@ -12270,51 +12309,303 @@
           <w:i w:val="0"/>
           <w:sz w:val="26"/>
         </w:rPr>
-        <w:t>Từ ma trận nhầm lẫn của KNN (mục 4.6), ba cặp chữ số dễ nhầm lẫn nhất là: 4→9 (23 lần), 8→3 (18 lần), 2→7 (18 lần), 8→5 (17 lần). Những nhầm lẫn này đều hợp lý về mặt hình học: các cặp số này có thể trông rất giống nhau khi nét viết tay không rõ ràng (ví dụ số 4 viết không khép kín phần trên dễ giống số 9; số 8 viết không khép kín vòng dưới dễ giống số 3 hoặc số 5) — và cũng chính là các cặp chồng lấn nhau trên biểu đồ PCA ở mục 4.7.</w:t>
-      </w:r>
-    </w:p>
-    <w:p>
-      <w:pPr>
-        <w:jc w:val="both"/>
-      </w:pPr>
-      <w:r>
-        <w:rPr>
-          <w:rFonts w:ascii="Times New Roman" w:hAnsi="Times New Roman"/>
-          <w:b w:val="0"/>
-          <w:i w:val="0"/>
-          <w:sz w:val="26"/>
-        </w:rPr>
-        <w:t>SVM giảm đáng kể các nhầm lẫn này — ví dụ số 8 chỉ còn bị nhầm thành số 3 ở 5 trường hợp và số 5 ở 3 trường hợp, so với 18 và 17 trường hợp của KNN. Điều này phù hợp với lý thuyết ở mục 2.3: SVM với kernel RBF có thể học một ranh giới quyết định phi tuyến phức tạp hơn nhiều so với ranh giới ngầm định theo khoảng cách Euclidean đơn giản của KNN, nên phân biệt tốt hơn các chữ số có hình dạng gần giống nhau.</w:t>
-      </w:r>
-    </w:p>
-    <w:p>
-      <w:pPr>
-        <w:pStyle w:val="Heading2"/>
-      </w:pPr>
-      <w:r>
-        <w:rPr>
-          <w:rFonts w:ascii="Times New Roman" w:hAnsi="Times New Roman"/>
-          <w:b/>
-          <w:color w:val="000000"/>
-          <w:sz w:val="28"/>
-        </w:rPr>
-        <w:t>4.11. Kết quả chương trình demo</w:t>
-      </w:r>
-    </w:p>
-    <w:p>
-      <w:pPr>
-        <w:jc w:val="both"/>
-      </w:pPr>
-      <w:r>
-        <w:rPr>
-          <w:rFonts w:ascii="Times New Roman" w:hAnsi="Times New Roman"/>
-          <w:b w:val="0"/>
-          <w:i w:val="0"/>
-          <w:sz w:val="26"/>
-        </w:rPr>
-        <w:t>Chương trình demo (mục 3.7) cho phép người dùng vẽ hoặc tải ảnh một chữ số lên, xem song song kết quả dự đoán của cả KNN và SVM kèm biểu đồ điểm tin cậy cho từng chữ số. Hình dưới đây là ảnh chụp màn hình THẬT của chương trình demo đang chạy (không dàn dựng), ở trạng thái ban đầu:</w:t>
-      </w:r>
-    </w:p>
+        <w:t>Một câu hỏi thực tiễn quan trọng khi triển khai học máy là: có cần thu thập thêm dữ liệu không, hay mô hình đã gần như bão hoà với lượng dữ liệu hiện có? Đồ án trả lời câu hỏi này cho KNN bằng cách huấn luyện lại với các tập con ngẫu nhiên có kích thước tăng dần từ tập huấn luyện gốc (giữ nguyên k=5), đo độ chính xác trên cùng tập validation:</w:t>
+      </w:r>
+    </w:p>
+    <w:p>
+      <w:pPr>
+        <w:jc w:val="center"/>
+      </w:pPr>
+      <w:r>
+        <w:rPr>
+          <w:rFonts w:ascii="Times New Roman" w:hAnsi="Times New Roman"/>
+          <w:i/>
+          <w:sz w:val="24"/>
+        </w:rPr>
+        <w:t>BẢNG 4.10: Đường cong học của KNN (k=5) theo kích thước tập huấn luyện</w:t>
+      </w:r>
+    </w:p>
+    <w:tbl>
+      <w:tblPr>
+        <w:tblStyle w:val="TableGrid"/>
+        <w:tblW w:type="auto" w:w="0"/>
+        <w:jc w:val="center"/>
+        <w:tblLook w:firstColumn="1" w:firstRow="1" w:lastColumn="0" w:lastRow="0" w:noHBand="0" w:noVBand="1" w:val="04A0"/>
+      </w:tblPr>
+      <w:tblGrid>
+        <w:gridCol w:w="4535"/>
+        <w:gridCol w:w="4535"/>
+      </w:tblGrid>
+      <w:tr>
+        <w:trPr>
+          <w:cantSplit/>
+        </w:trPr>
+        <w:tc>
+          <w:tcPr>
+            <w:tcW w:type="dxa" w:w="3402"/>
+          </w:tcPr>
+          <w:p>
+            <w:pPr>
+              <w:jc w:val="center"/>
+            </w:pPr>
+            <w:r/>
+            <w:r>
+              <w:rPr>
+                <w:rFonts w:ascii="Times New Roman" w:hAnsi="Times New Roman"/>
+                <w:b/>
+                <w:i w:val="0"/>
+                <w:sz w:val="24"/>
+              </w:rPr>
+              <w:t>Số mẫu huấn luyện</w:t>
+            </w:r>
+          </w:p>
+        </w:tc>
+        <w:tc>
+          <w:tcPr>
+            <w:tcW w:type="dxa" w:w="4535"/>
+          </w:tcPr>
+          <w:p>
+            <w:pPr>
+              <w:jc w:val="center"/>
+            </w:pPr>
+            <w:r/>
+            <w:r>
+              <w:rPr>
+                <w:rFonts w:ascii="Times New Roman" w:hAnsi="Times New Roman"/>
+                <w:b/>
+                <w:i w:val="0"/>
+                <w:sz w:val="24"/>
+              </w:rPr>
+              <w:t>Độ chính xác (validation)</w:t>
+            </w:r>
+          </w:p>
+        </w:tc>
+      </w:tr>
+      <w:tr>
+        <w:trPr>
+          <w:cantSplit/>
+        </w:trPr>
+        <w:tc>
+          <w:tcPr>
+            <w:tcW w:type="dxa" w:w="3402"/>
+          </w:tcPr>
+          <w:p>
+            <w:r/>
+            <w:r>
+              <w:rPr>
+                <w:rFonts w:ascii="Times New Roman" w:hAnsi="Times New Roman"/>
+                <w:b w:val="0"/>
+                <w:i w:val="0"/>
+                <w:sz w:val="24"/>
+              </w:rPr>
+              <w:t>1.000</w:t>
+            </w:r>
+          </w:p>
+        </w:tc>
+        <w:tc>
+          <w:tcPr>
+            <w:tcW w:type="dxa" w:w="4535"/>
+          </w:tcPr>
+          <w:p>
+            <w:pPr>
+              <w:jc w:val="center"/>
+            </w:pPr>
+            <w:r/>
+            <w:r>
+              <w:rPr>
+                <w:rFonts w:ascii="Times New Roman" w:hAnsi="Times New Roman"/>
+                <w:b w:val="0"/>
+                <w:i w:val="0"/>
+                <w:sz w:val="24"/>
+              </w:rPr>
+              <w:t>0,8805</w:t>
+            </w:r>
+          </w:p>
+        </w:tc>
+      </w:tr>
+      <w:tr>
+        <w:trPr>
+          <w:cantSplit/>
+        </w:trPr>
+        <w:tc>
+          <w:tcPr>
+            <w:tcW w:type="dxa" w:w="3402"/>
+          </w:tcPr>
+          <w:p>
+            <w:r/>
+            <w:r>
+              <w:rPr>
+                <w:rFonts w:ascii="Times New Roman" w:hAnsi="Times New Roman"/>
+                <w:b w:val="0"/>
+                <w:i w:val="0"/>
+                <w:sz w:val="24"/>
+              </w:rPr>
+              <w:t>5.000</w:t>
+            </w:r>
+          </w:p>
+        </w:tc>
+        <w:tc>
+          <w:tcPr>
+            <w:tcW w:type="dxa" w:w="4535"/>
+          </w:tcPr>
+          <w:p>
+            <w:pPr>
+              <w:jc w:val="center"/>
+            </w:pPr>
+            <w:r/>
+            <w:r>
+              <w:rPr>
+                <w:rFonts w:ascii="Times New Roman" w:hAnsi="Times New Roman"/>
+                <w:b w:val="0"/>
+                <w:i w:val="0"/>
+                <w:sz w:val="24"/>
+              </w:rPr>
+              <w:t>0,9368</w:t>
+            </w:r>
+          </w:p>
+        </w:tc>
+      </w:tr>
+      <w:tr>
+        <w:trPr>
+          <w:cantSplit/>
+        </w:trPr>
+        <w:tc>
+          <w:tcPr>
+            <w:tcW w:type="dxa" w:w="3402"/>
+          </w:tcPr>
+          <w:p>
+            <w:r/>
+            <w:r>
+              <w:rPr>
+                <w:rFonts w:ascii="Times New Roman" w:hAnsi="Times New Roman"/>
+                <w:b w:val="0"/>
+                <w:i w:val="0"/>
+                <w:sz w:val="24"/>
+              </w:rPr>
+              <w:t>10.000</w:t>
+            </w:r>
+          </w:p>
+        </w:tc>
+        <w:tc>
+          <w:tcPr>
+            <w:tcW w:type="dxa" w:w="4535"/>
+          </w:tcPr>
+          <w:p>
+            <w:pPr>
+              <w:jc w:val="center"/>
+            </w:pPr>
+            <w:r/>
+            <w:r>
+              <w:rPr>
+                <w:rFonts w:ascii="Times New Roman" w:hAnsi="Times New Roman"/>
+                <w:b w:val="0"/>
+                <w:i w:val="0"/>
+                <w:sz w:val="24"/>
+              </w:rPr>
+              <w:t>0,9523</w:t>
+            </w:r>
+          </w:p>
+        </w:tc>
+      </w:tr>
+      <w:tr>
+        <w:trPr>
+          <w:cantSplit/>
+        </w:trPr>
+        <w:tc>
+          <w:tcPr>
+            <w:tcW w:type="dxa" w:w="3402"/>
+          </w:tcPr>
+          <w:p>
+            <w:r/>
+            <w:r>
+              <w:rPr>
+                <w:rFonts w:ascii="Times New Roman" w:hAnsi="Times New Roman"/>
+                <w:b w:val="0"/>
+                <w:i w:val="0"/>
+                <w:sz w:val="24"/>
+              </w:rPr>
+              <w:t>20.000</w:t>
+            </w:r>
+          </w:p>
+        </w:tc>
+        <w:tc>
+          <w:tcPr>
+            <w:tcW w:type="dxa" w:w="4535"/>
+          </w:tcPr>
+          <w:p>
+            <w:pPr>
+              <w:jc w:val="center"/>
+            </w:pPr>
+            <w:r/>
+            <w:r>
+              <w:rPr>
+                <w:rFonts w:ascii="Times New Roman" w:hAnsi="Times New Roman"/>
+                <w:b w:val="0"/>
+                <w:i w:val="0"/>
+                <w:sz w:val="24"/>
+              </w:rPr>
+              <w:t>0,9632</w:t>
+            </w:r>
+          </w:p>
+        </w:tc>
+      </w:tr>
+      <w:tr>
+        <w:trPr>
+          <w:cantSplit/>
+        </w:trPr>
+        <w:tc>
+          <w:tcPr>
+            <w:tcW w:type="dxa" w:w="3402"/>
+          </w:tcPr>
+          <w:p>
+            <w:r/>
+            <w:r>
+              <w:rPr>
+                <w:rFonts w:ascii="Times New Roman" w:hAnsi="Times New Roman"/>
+                <w:b w:val="0"/>
+                <w:i w:val="0"/>
+                <w:sz w:val="24"/>
+              </w:rPr>
+              <w:t>54.000</w:t>
+            </w:r>
+          </w:p>
+        </w:tc>
+        <w:tc>
+          <w:tcPr>
+            <w:tcW w:type="dxa" w:w="4535"/>
+          </w:tcPr>
+          <w:p>
+            <w:pPr>
+              <w:jc w:val="center"/>
+            </w:pPr>
+            <w:r/>
+            <w:r>
+              <w:rPr>
+                <w:rFonts w:ascii="Times New Roman" w:hAnsi="Times New Roman"/>
+                <w:b w:val="0"/>
+                <w:i w:val="0"/>
+                <w:sz w:val="24"/>
+              </w:rPr>
+              <w:t>0,9735</w:t>
+            </w:r>
+          </w:p>
+        </w:tc>
+      </w:tr>
+    </w:tbl>
+    <w:p>
+      <w:pPr>
+        <w:jc w:val="center"/>
+      </w:pPr>
+      <w:r>
+        <w:rPr>
+          <w:rFonts w:ascii="Times New Roman" w:hAnsi="Times New Roman"/>
+          <w:i/>
+          <w:sz w:val="22"/>
+        </w:rPr>
+        <w:t>(Nguồn: results/extra_experiments.json của đồ án)</w:t>
+      </w:r>
+    </w:p>
+    <w:p/>
     <w:p>
       <w:pPr>
         <w:jc w:val="center"/>
@@ -12322,7 +12613,7 @@
       <w:r>
         <w:drawing>
           <wp:inline xmlns:a="http://schemas.openxmlformats.org/drawingml/2006/main" xmlns:pic="http://schemas.openxmlformats.org/drawingml/2006/picture">
-            <wp:extent cx="4680000" cy="3290625"/>
+            <wp:extent cx="4680000" cy="2808000"/>
             <wp:docPr id="21" name="Picture 21"/>
             <wp:cNvGraphicFramePr>
               <a:graphicFrameLocks noChangeAspect="1"/>
@@ -12331,7 +12622,7 @@
               <a:graphicData uri="http://schemas.openxmlformats.org/drawingml/2006/picture">
                 <pic:pic>
                   <pic:nvPicPr>
-                    <pic:cNvPr id="0" name="01_giao_dien_ban_dau.png"/>
+                    <pic:cNvPr id="0" name="chart_learning_curve.png"/>
                     <pic:cNvPicPr/>
                   </pic:nvPicPr>
                   <pic:blipFill>
@@ -12343,7 +12634,7 @@
                   <pic:spPr>
                     <a:xfrm>
                       <a:off x="0" y="0"/>
-                      <a:ext cx="4680000" cy="3290625"/>
+                      <a:ext cx="4680000" cy="2808000"/>
                     </a:xfrm>
                     <a:prstGeom prst="rect"/>
                   </pic:spPr>
@@ -12364,7 +12655,7 @@
           <w:i/>
           <w:sz w:val="24"/>
         </w:rPr>
-        <w:t>HÌNH 4.7: Giao diện demo ở trạng thái ban đầu</w:t>
+        <w:t>HÌNH 4.7: Đường cong học của KNN (k=5) theo kích thước tập huấn luyện</w:t>
       </w:r>
     </w:p>
     <w:p>
@@ -12377,7 +12668,7 @@
           <w:i/>
           <w:sz w:val="22"/>
         </w:rPr>
-        <w:t>(Nguồn: ảnh chụp màn hình chương trình demo thật của đồ án)</w:t>
+        <w:t>(Nguồn: results/extra_experiments.json của đồ án)</w:t>
       </w:r>
     </w:p>
     <w:p>
@@ -12391,7 +12682,77 @@
           <w:i w:val="0"/>
           <w:sz w:val="26"/>
         </w:rPr>
-        <w:t>Khi tải lên một ảnh chữ số thật lấy từ tập kiểm thử MNIST (nhãn thật là số 7, không nằm trong tập huấn luyện của cả hai mô hình), cả KNN và SVM đều dự đoán đúng là số 7, với điểm tin cậy cao nhất rõ rệt ở cột tương ứng:</w:t>
+        <w:t>Độ chính xác tăng nhanh khi tăng từ 1.000 lên 10.000 mẫu (từ 0,8805 lên 0,9523), sau đó tốc độ cải thiện chậm dần rõ rệt khi tăng tiếp lên 20.000 và 54.000 mẫu, dù vẫn còn tăng nhẹ (đạt 0,9735 ở 54.000 mẫu — khớp với kết quả ở mục 4.2). Đường cong chưa hoàn toàn đi ngang (plateau), gợi ý rằng việc thu thập thêm dữ liệu thật ngoài 54.000 mẫu hiện có vẫn có thể cải thiện thêm độ chính xác, dù mức cải thiện biên sẽ ngày càng nhỏ — một nhận định hữu ích cho hướng phát triển (Chương 5) nếu có điều kiện mở rộng dữ liệu huấn luyện trong tương lai. Do chi phí huấn luyện SVM cao (mục 4.2, 4.5), đồ án không lặp lại khảo sát này cho SVM trên nhiều kích thước tập huấn luyện khác nhau trong phạm vi thời gian cho phép.</w:t>
+      </w:r>
+    </w:p>
+    <w:p>
+      <w:pPr>
+        <w:pStyle w:val="Heading2"/>
+      </w:pPr>
+      <w:r>
+        <w:rPr>
+          <w:rFonts w:ascii="Times New Roman" w:hAnsi="Times New Roman"/>
+          <w:b/>
+          <w:color w:val="000000"/>
+          <w:sz w:val="28"/>
+        </w:rPr>
+        <w:t>4.11. Phân tích định tính các ca lỗi</w:t>
+      </w:r>
+    </w:p>
+    <w:p>
+      <w:pPr>
+        <w:jc w:val="both"/>
+      </w:pPr>
+      <w:r>
+        <w:rPr>
+          <w:rFonts w:ascii="Times New Roman" w:hAnsi="Times New Roman"/>
+          <w:b w:val="0"/>
+          <w:i w:val="0"/>
+          <w:sz w:val="26"/>
+        </w:rPr>
+        <w:t>Từ ma trận nhầm lẫn của KNN (mục 4.6), ba cặp chữ số dễ nhầm lẫn nhất là: 4→9 (23 lần), 8→3 (18 lần), 2→7 (18 lần), 8→5 (17 lần). Những nhầm lẫn này đều hợp lý về mặt hình học: các cặp số này có thể trông rất giống nhau khi nét viết tay không rõ ràng (ví dụ số 4 viết không khép kín phần trên dễ giống số 9; số 8 viết không khép kín vòng dưới dễ giống số 3 hoặc số 5) — và cũng chính là các cặp chồng lấn nhau trên biểu đồ PCA ở mục 4.7.</w:t>
+      </w:r>
+    </w:p>
+    <w:p>
+      <w:pPr>
+        <w:jc w:val="both"/>
+      </w:pPr>
+      <w:r>
+        <w:rPr>
+          <w:rFonts w:ascii="Times New Roman" w:hAnsi="Times New Roman"/>
+          <w:b w:val="0"/>
+          <w:i w:val="0"/>
+          <w:sz w:val="26"/>
+        </w:rPr>
+        <w:t>SVM giảm đáng kể các nhầm lẫn này — ví dụ số 8 chỉ còn bị nhầm thành số 3 ở 5 trường hợp và số 5 ở 3 trường hợp, so với 18 và 17 trường hợp của KNN. Điều này phù hợp với lý thuyết ở mục 2.3: SVM với kernel RBF có thể học một ranh giới quyết định phi tuyến phức tạp hơn nhiều so với ranh giới ngầm định theo khoảng cách Euclidean đơn giản của KNN, nên phân biệt tốt hơn các chữ số có hình dạng gần giống nhau.</w:t>
+      </w:r>
+    </w:p>
+    <w:p>
+      <w:pPr>
+        <w:pStyle w:val="Heading2"/>
+      </w:pPr>
+      <w:r>
+        <w:rPr>
+          <w:rFonts w:ascii="Times New Roman" w:hAnsi="Times New Roman"/>
+          <w:b/>
+          <w:color w:val="000000"/>
+          <w:sz w:val="28"/>
+        </w:rPr>
+        <w:t>4.12. Kết quả chương trình demo</w:t>
+      </w:r>
+    </w:p>
+    <w:p>
+      <w:pPr>
+        <w:jc w:val="both"/>
+      </w:pPr>
+      <w:r>
+        <w:rPr>
+          <w:rFonts w:ascii="Times New Roman" w:hAnsi="Times New Roman"/>
+          <w:b w:val="0"/>
+          <w:i w:val="0"/>
+          <w:sz w:val="26"/>
+        </w:rPr>
+        <w:t>Chương trình demo (mục 3.7) cho phép người dùng vẽ hoặc tải ảnh một chữ số lên, xem song song kết quả dự đoán của cả KNN và SVM kèm biểu đồ điểm tin cậy cho từng chữ số. Hình dưới đây là ảnh chụp màn hình THẬT của chương trình demo đang chạy (không dàn dựng), ở trạng thái ban đầu:</w:t>
       </w:r>
     </w:p>
     <w:p>
@@ -12410,7 +12771,7 @@
               <a:graphicData uri="http://schemas.openxmlformats.org/drawingml/2006/picture">
                 <pic:pic>
                   <pic:nvPicPr>
-                    <pic:cNvPr id="0" name="02_tai_anh_len_ket_qua.png"/>
+                    <pic:cNvPr id="0" name="01_giao_dien_ban_dau.png"/>
                     <pic:cNvPicPr/>
                   </pic:nvPicPr>
                   <pic:blipFill>
@@ -12443,7 +12804,7 @@
           <w:i/>
           <w:sz w:val="24"/>
         </w:rPr>
-        <w:t>HÌNH 4.8: Kết quả dự đoán thật khi tải ảnh chữ số "7" từ tập kiểm thử MNIST</w:t>
+        <w:t>HÌNH 4.8: Giao diện demo ở trạng thái ban đầu</w:t>
       </w:r>
     </w:p>
     <w:p>
@@ -12470,6 +12831,85 @@
           <w:i w:val="0"/>
           <w:sz w:val="26"/>
         </w:rPr>
+        <w:t>Khi tải lên một ảnh chữ số thật lấy từ tập kiểm thử MNIST (nhãn thật là số 7, không nằm trong tập huấn luyện của cả hai mô hình), cả KNN và SVM đều dự đoán đúng là số 7, với điểm tin cậy cao nhất rõ rệt ở cột tương ứng:</w:t>
+      </w:r>
+    </w:p>
+    <w:p>
+      <w:pPr>
+        <w:jc w:val="center"/>
+      </w:pPr>
+      <w:r>
+        <w:drawing>
+          <wp:inline xmlns:a="http://schemas.openxmlformats.org/drawingml/2006/main" xmlns:pic="http://schemas.openxmlformats.org/drawingml/2006/picture">
+            <wp:extent cx="4680000" cy="3290625"/>
+            <wp:docPr id="23" name="Picture 23"/>
+            <wp:cNvGraphicFramePr>
+              <a:graphicFrameLocks noChangeAspect="1"/>
+            </wp:cNvGraphicFramePr>
+            <a:graphic>
+              <a:graphicData uri="http://schemas.openxmlformats.org/drawingml/2006/picture">
+                <pic:pic>
+                  <pic:nvPicPr>
+                    <pic:cNvPr id="0" name="02_tai_anh_len_ket_qua.png"/>
+                    <pic:cNvPicPr/>
+                  </pic:nvPicPr>
+                  <pic:blipFill>
+                    <a:blip r:embed="rId31"/>
+                    <a:stretch>
+                      <a:fillRect/>
+                    </a:stretch>
+                  </pic:blipFill>
+                  <pic:spPr>
+                    <a:xfrm>
+                      <a:off x="0" y="0"/>
+                      <a:ext cx="4680000" cy="3290625"/>
+                    </a:xfrm>
+                    <a:prstGeom prst="rect"/>
+                  </pic:spPr>
+                </pic:pic>
+              </a:graphicData>
+            </a:graphic>
+          </wp:inline>
+        </w:drawing>
+      </w:r>
+    </w:p>
+    <w:p>
+      <w:pPr>
+        <w:jc w:val="center"/>
+      </w:pPr>
+      <w:r>
+        <w:rPr>
+          <w:rFonts w:ascii="Times New Roman" w:hAnsi="Times New Roman"/>
+          <w:i/>
+          <w:sz w:val="24"/>
+        </w:rPr>
+        <w:t>HÌNH 4.9: Kết quả dự đoán thật khi tải ảnh chữ số "7" từ tập kiểm thử MNIST</w:t>
+      </w:r>
+    </w:p>
+    <w:p>
+      <w:pPr>
+        <w:jc w:val="center"/>
+      </w:pPr>
+      <w:r>
+        <w:rPr>
+          <w:rFonts w:ascii="Times New Roman" w:hAnsi="Times New Roman"/>
+          <w:i/>
+          <w:sz w:val="22"/>
+        </w:rPr>
+        <w:t>(Nguồn: ảnh chụp màn hình chương trình demo thật của đồ án)</w:t>
+      </w:r>
+    </w:p>
+    <w:p>
+      <w:pPr>
+        <w:jc w:val="both"/>
+      </w:pPr>
+      <w:r>
+        <w:rPr>
+          <w:rFonts w:ascii="Times New Roman" w:hAnsi="Times New Roman"/>
+          <w:b w:val="0"/>
+          <w:i w:val="0"/>
+          <w:sz w:val="26"/>
+        </w:rPr>
         <w:t>Một video demo thật (quay bằng Playwright, giả lập thao tác chuột thật để vẽ ba chữ số khác nhau và tải lên bốn ảnh test MNIST thật khác nhau, toàn bộ bảy lần dự đoán đều đúng ở cả hai mô hình) được lưu kèm theo đồ án tại `thesis/abs/demo_video.mp4`.</w:t>
       </w:r>
     </w:p>
@@ -12484,7 +12924,7 @@
           <w:color w:val="000000"/>
           <w:sz w:val="28"/>
         </w:rPr>
-        <w:t>4.12. Hạn chế của chương trình demo</w:t>
+        <w:t>4.13. Hạn chế của chương trình demo</w:t>
       </w:r>
     </w:p>
     <w:p>
@@ -12534,7 +12974,7 @@
           <w:color w:val="000000"/>
           <w:sz w:val="28"/>
         </w:rPr>
-        <w:t>4.13. Thảo luận tổng hợp</w:t>
+        <w:t>4.14. Thảo luận tổng hợp</w:t>
       </w:r>
     </w:p>
     <w:p>
@@ -12562,7 +13002,7 @@
           <w:i w:val="0"/>
           <w:sz w:val="26"/>
         </w:rPr>
-        <w:t>Phân tích PCA (mục 4.7) và phân tích lỗi định tính (mục 4.10) cho thấy hai nguồn thông tin độc lập (cấu trúc không gian đặc trưng và ma trận nhầm lẫn thật) đều chỉ ra cùng một nhóm chữ số khó phân biệt (4, 7, 9 và 3, 5, 8), tăng độ tin cậy cho kết luận này. Về mặt thực tiễn, lựa chọn giữa KNN và SVM nên dựa vào bối cảnh triển khai: KNN phù hợp hơn khi cần huấn luyện/cập nhật nhanh hoặc tài nguyên tính toán lúc huấn luyện hạn chế; SVM phù hợp hơn khi độ chính xác là ưu tiên hàng đầu và mô hình chỉ cần huấn luyện một lần rồi dùng lâu dài.</w:t>
+        <w:t>Phân tích PCA (mục 4.7) và phân tích lỗi định tính (mục 4.11) cho thấy hai nguồn thông tin độc lập (cấu trúc không gian đặc trưng và ma trận nhầm lẫn thật) đều chỉ ra cùng một nhóm chữ số khó phân biệt (4, 7, 9 và 3, 5, 8), tăng độ tin cậy cho kết luận này. Về mặt thực tiễn, lựa chọn giữa KNN và SVM nên dựa vào bối cảnh triển khai: KNN phù hợp hơn khi cần huấn luyện/cập nhật nhanh hoặc tài nguyên tính toán lúc huấn luyện hạn chế; SVM phù hợp hơn khi độ chính xác là ưu tiên hàng đầu và mô hình chỉ cần huấn luyện một lần rồi dùng lâu dài.</w:t>
       </w:r>
     </w:p>
     <w:p>

</xml_diff>

<commit_message>
fix: chỉnh tên khoa, rút gọn tên đồ án trên bìa, bỏ khoảng trống thừa
- Gộp "TRƯỜNG KỸ THUẬT VÀ CÔNG NGHỆ" + "KHOA CÔNG NGHỆ THÔNG TIN" thành
  một dòng "KHOA KỸ THUẬT VÀ CÔNG NGHỆ" theo đúng tên đơn vị thật
- Rút gọn tên đồ án trên bìa và bản nhận xét về "NHẬN DẠNG CHỮ SỐ VIẾT TAY"
  (bỏ phụ đề phương pháp)
- Bỏ dòng trống thừa giữa "Giảng viên hướng dẫn" và "Sinh viên thực hiện"

Co-Authored-By: Claude Sonnet 5 <noreply@anthropic.com>
Claude-Session: https://claude.ai/code/session_012MsmdJyXAipgvwuSTidUDk
</commit_message>
<xml_diff>
--- a/thesis/doc/thesis.docx
+++ b/thesis/doc/thesis.docx
@@ -29,22 +29,7 @@
           <w:i w:val="0"/>
           <w:sz w:val="32"/>
         </w:rPr>
-        <w:t>TRƯỜNG KỸ THUẬT VÀ CÔNG NGHỆ</w:t>
-      </w:r>
-    </w:p>
-    <w:p>
-      <w:pPr>
-        <w:spacing w:after="0"/>
-        <w:jc w:val="center"/>
-      </w:pPr>
-      <w:r>
-        <w:rPr>
-          <w:rFonts w:ascii="Times New Roman" w:hAnsi="Times New Roman"/>
-          <w:b/>
-          <w:i w:val="0"/>
-          <w:sz w:val="28"/>
-        </w:rPr>
-        <w:t>KHOA CÔNG NGHỆ THÔNG TIN</w:t>
+        <w:t>KHOA KỸ THUẬT VÀ CÔNG NGHỆ</w:t>
       </w:r>
     </w:p>
     <w:p>
@@ -114,10 +99,6 @@
           <w:sz w:val="36"/>
         </w:rPr>
         <w:t>NHẬN DẠNG CHỮ SỐ VIẾT TAY</w:t>
-        <w:br/>
-        <w:t>HUẤN LUYỆN VÀ SO SÁNH KNN, SVM</w:t>
-        <w:br/>
-        <w:t>TRÊN TẬP DỮ LIỆU MNIST</w:t>
       </w:r>
     </w:p>
     <w:p/>
@@ -138,19 +119,6 @@
           <w:sz w:val="28"/>
         </w:rPr>
         <w:t>THS. NGUYỄN NHỨT LAM</w:t>
-      </w:r>
-    </w:p>
-    <w:p>
-      <w:pPr>
-        <w:spacing w:after="0"/>
-      </w:pPr>
-      <w:r>
-        <w:rPr>
-          <w:rFonts w:ascii="Times New Roman" w:hAnsi="Times New Roman"/>
-          <w:b w:val="0"/>
-          <w:i w:val="0"/>
-          <w:sz w:val="26"/>
-        </w:rPr>
       </w:r>
     </w:p>
     <w:p>
@@ -273,22 +241,7 @@
           <w:i w:val="0"/>
           <w:sz w:val="32"/>
         </w:rPr>
-        <w:t>TRƯỜNG KỸ THUẬT VÀ CÔNG NGHỆ</w:t>
-      </w:r>
-    </w:p>
-    <w:p>
-      <w:pPr>
-        <w:spacing w:after="0"/>
-        <w:jc w:val="center"/>
-      </w:pPr>
-      <w:r>
-        <w:rPr>
-          <w:rFonts w:ascii="Times New Roman" w:hAnsi="Times New Roman"/>
-          <w:b/>
-          <w:i w:val="0"/>
-          <w:sz w:val="28"/>
-        </w:rPr>
-        <w:t>KHOA CÔNG NGHỆ THÔNG TIN</w:t>
+        <w:t>KHOA KỸ THUẬT VÀ CÔNG NGHỆ</w:t>
       </w:r>
     </w:p>
     <w:p>
@@ -358,10 +311,6 @@
           <w:sz w:val="36"/>
         </w:rPr>
         <w:t>NHẬN DẠNG CHỮ SỐ VIẾT TAY</w:t>
-        <w:br/>
-        <w:t>HUẤN LUYỆN VÀ SO SÁNH KNN, SVM</w:t>
-        <w:br/>
-        <w:t>TRÊN TẬP DỮ LIỆU MNIST</w:t>
       </w:r>
     </w:p>
     <w:p/>
@@ -382,19 +331,6 @@
           <w:sz w:val="28"/>
         </w:rPr>
         <w:t>THS. NGUYỄN NHỨT LAM</w:t>
-      </w:r>
-    </w:p>
-    <w:p>
-      <w:pPr>
-        <w:spacing w:after="0"/>
-      </w:pPr>
-      <w:r>
-        <w:rPr>
-          <w:rFonts w:ascii="Times New Roman" w:hAnsi="Times New Roman"/>
-          <w:b w:val="0"/>
-          <w:i w:val="0"/>
-          <w:sz w:val="26"/>
-        </w:rPr>
       </w:r>
     </w:p>
     <w:p>
@@ -2554,7 +2490,7 @@
           <w:i w:val="0"/>
           <w:sz w:val="26"/>
         </w:rPr>
-        <w:t>Em cũng xin cảm ơn quý thầy cô KHOA CÔNG NGHỆ THÔNG TIN, TRƯỜNG KỸ THUẬT VÀ CÔNG NGHỆ, TRƯỜNG ĐẠI HỌC TRÀ VINH đã truyền đạt kiến thức nền tảng về học máy trong suốt quá trình học tập, là cơ sở để em có thể tiếp cận và triển khai đồ án ở mức độ kỹ thuật như trình bày trong báo cáo này.</w:t>
+        <w:t>Em cũng xin cảm ơn quý thầy cô KHOA KỸ THUẬT VÀ CÔNG NGHỆ, TRƯỜNG ĐẠI HỌC TRÀ VINH đã truyền đạt kiến thức nền tảng về học máy trong suốt quá trình học tập, là cơ sở để em có thể tiếp cận và triển khai đồ án ở mức độ kỹ thuật như trình bày trong báo cáo này.</w:t>
       </w:r>
     </w:p>
     <w:p>
@@ -2902,7 +2838,7 @@
           <w:i w:val="0"/>
           <w:sz w:val="26"/>
         </w:rPr>
-        <w:t>Tên đồ án: NHẬN DẠNG CHỮ SỐ VIẾT TAY HUẤN LUYỆN VÀ SO SÁNH KNN, SVM TRÊN TẬP DỮ LIỆU MNIST</w:t>
+        <w:t>Tên đồ án: NHẬN DẠNG CHỮ SỐ VIẾT TAY</w:t>
       </w:r>
     </w:p>
     <w:p>

</xml_diff>

<commit_message>
fix: thêm khoảng cách quanh logo bìa, đổi địa điểm nộp, đẩy ngày xuống cuối trang
- Thêm dòng trống trước/sau logo trường trên bìa cho thoáng hơn
- Đổi địa điểm nộp đồ án từ "Trà Vinh" thành "TP. Hồ Chí Minh" (theo xác
  nhận của sinh viên) - không ảnh hưởng tới các dòng ký tên GVHD/giảng
  viên chấm trong bản nhận xét (vẫn giữ "Trà Vinh" vì đó là nơi trường đặt)
- Đẩy dòng "TP. Hồ Chí Minh, tháng 10 năm 2026" xuống gần cuối trang bìa

Co-Authored-By: Claude Sonnet 5 <noreply@anthropic.com>
Claude-Session: https://claude.ai/code/session_012MsmdJyXAipgvwuSTidUDk
</commit_message>
<xml_diff>
--- a/thesis/doc/thesis.docx
+++ b/thesis/doc/thesis.docx
@@ -32,6 +32,7 @@
         <w:t>KHOA KỸ THUẬT VÀ CÔNG NGHỆ</w:t>
       </w:r>
     </w:p>
+    <w:p/>
     <w:p>
       <w:pPr>
         <w:jc w:val="center"/>
@@ -71,6 +72,7 @@
         </w:drawing>
       </w:r>
     </w:p>
+    <w:p/>
     <w:p>
       <w:pPr>
         <w:spacing w:after="120"/>
@@ -195,6 +197,8 @@
     </w:p>
     <w:p/>
     <w:p/>
+    <w:p/>
+    <w:p/>
     <w:p>
       <w:pPr>
         <w:jc w:val="center"/>
@@ -206,7 +210,7 @@
           <w:i w:val="0"/>
           <w:sz w:val="26"/>
         </w:rPr>
-        <w:t>Trà Vinh, tháng 10 năm 2026</w:t>
+        <w:t>TP. Hồ Chí Minh, tháng 10 năm 2026</w:t>
       </w:r>
     </w:p>
     <w:p>
@@ -244,6 +248,7 @@
         <w:t>KHOA KỸ THUẬT VÀ CÔNG NGHỆ</w:t>
       </w:r>
     </w:p>
+    <w:p/>
     <w:p>
       <w:pPr>
         <w:jc w:val="center"/>
@@ -283,6 +288,7 @@
         </w:drawing>
       </w:r>
     </w:p>
+    <w:p/>
     <w:p>
       <w:pPr>
         <w:spacing w:after="120"/>
@@ -407,6 +413,8 @@
     </w:p>
     <w:p/>
     <w:p/>
+    <w:p/>
+    <w:p/>
     <w:p>
       <w:pPr>
         <w:jc w:val="center"/>
@@ -418,7 +426,7 @@
           <w:i w:val="0"/>
           <w:sz w:val="26"/>
         </w:rPr>
-        <w:t>Trà Vinh, tháng 10 năm 2026</w:t>
+        <w:t>TP. Hồ Chí Minh, tháng 10 năm 2026</w:t>
       </w:r>
     </w:p>
     <w:p>

</xml_diff>

<commit_message>
fix: bỏ số trang trên bìa, đổi đánh số trang phần đầu từ La Mã sang Ả Rập
- Bìa chính/bìa lót: không hiển thị số trang (tách thành section riêng,
  footer để trống)
- Phần đầu (Tóm tắt, Mục lục, Mở đầu, Lời cảm ơn, Nhận xét, Danh mục từ
  viết tắt): đổi từ số La Mã thường (i, ii, iii...) sang số Ả Rập (1, 2,
  3...), bắt đầu từ 1 ngay sau bìa
- Chương 1 trở đi: vẫn đánh số Ả Rập riêng, bắt đầu lại từ 1 (không đổi)
- Mục lục hội tụ chính xác (0/57 mục lệch số trang)

Co-Authored-By: Claude Sonnet 5 <noreply@anthropic.com>
Claude-Session: https://claude.ai/code/session_012MsmdJyXAipgvwuSTidUDk
</commit_message>
<xml_diff>
--- a/thesis/doc/thesis.docx
+++ b/thesis/doc/thesis.docx
@@ -53,7 +53,7 @@
                     <pic:cNvPicPr/>
                   </pic:nvPicPr>
                   <pic:blipFill>
-                    <a:blip r:embed="rId10"/>
+                    <a:blip r:embed="rId9"/>
                     <a:stretch>
                       <a:fillRect/>
                     </a:stretch>
@@ -269,7 +269,7 @@
                     <pic:cNvPicPr/>
                   </pic:nvPicPr>
                   <pic:blipFill>
-                    <a:blip r:embed="rId10"/>
+                    <a:blip r:embed="rId9"/>
                     <a:stretch>
                       <a:fillRect/>
                     </a:stretch>
@@ -436,6 +436,16 @@
     </w:p>
     <w:p>
       <w:pPr>
+        <w:sectPr>
+          <w:pgSz w:w="11906" w:h="16838"/>
+          <w:pgMar w:top="1134" w:right="1134" w:bottom="1134" w:left="1701" w:header="720" w:footer="720" w:gutter="0"/>
+          <w:cols w:space="720"/>
+          <w:docGrid w:linePitch="360"/>
+        </w:sectPr>
+      </w:pPr>
+    </w:p>
+    <w:p>
+      <w:pPr>
         <w:pStyle w:val="Heading1"/>
         <w:jc w:val="center"/>
       </w:pPr>
@@ -540,7 +550,7 @@
         </w:rPr>
         <w:t>MỞ ĐẦU</w:t>
         <w:tab/>
-        <w:t>vi</w:t>
+        <w:t>4</w:t>
       </w:r>
     </w:p>
     <w:p>
@@ -559,7 +569,7 @@
         </w:rPr>
         <w:t>1. Lý do chọn đề tài</w:t>
         <w:tab/>
-        <w:t>vi</w:t>
+        <w:t>4</w:t>
       </w:r>
     </w:p>
     <w:p>
@@ -578,7 +588,7 @@
         </w:rPr>
         <w:t>2. Mục tiêu nghiên cứu</w:t>
         <w:tab/>
-        <w:t>vi</w:t>
+        <w:t>4</w:t>
       </w:r>
     </w:p>
     <w:p>
@@ -597,7 +607,7 @@
         </w:rPr>
         <w:t>3. Đối tượng và phạm vi nghiên cứu</w:t>
         <w:tab/>
-        <w:t>vii</w:t>
+        <w:t>5</w:t>
       </w:r>
     </w:p>
     <w:p>
@@ -616,7 +626,7 @@
         </w:rPr>
         <w:t>4. Phương pháp nghiên cứu</w:t>
         <w:tab/>
-        <w:t>viii</w:t>
+        <w:t>6</w:t>
       </w:r>
     </w:p>
     <w:p>
@@ -635,7 +645,7 @@
         </w:rPr>
         <w:t>5. Cấu trúc báo cáo</w:t>
         <w:tab/>
-        <w:t>viii</w:t>
+        <w:t>6</w:t>
       </w:r>
     </w:p>
     <w:p>
@@ -3884,12 +3894,12 @@
     <w:p>
       <w:pPr>
         <w:sectPr>
-          <w:footerReference w:type="default" r:id="rId9"/>
+          <w:footerReference w:type="default" r:id="rId10"/>
           <w:pgSz w:w="11906" w:h="16838"/>
           <w:pgMar w:top="1134" w:right="1134" w:bottom="1134" w:left="1701" w:header="720" w:footer="720" w:gutter="0"/>
           <w:cols w:space="720"/>
           <w:docGrid w:linePitch="360"/>
-          <w:pgNumType w:fmt="lowerRoman" w:start="1"/>
+          <w:pgNumType w:fmt="decimal" w:start="1"/>
         </w:sectPr>
       </w:pPr>
     </w:p>

</xml_diff>

<commit_message>
feat: nâng nội dung lên tổng 65 trang bằng 2 thực nghiệm thật mới
- Thêm mục 4.15 kiểm chứng độ ổn định KNN bằng stratified 5-fold
  cross-validation trên tập con 10.000 mẫu (bảng + biểu đồ thật)
- Bổ sung vào mục 4.11 hai hình minh hoạ ảnh dự đoán sai thật của
  KNN và SVM lấy ngẫu nhiên từ tập test MNIST
- scripts/kfold_and_error_analysis.py: script thực nghiệm mới, có
  sanity-check đối chiếu lại độ chính xác đã lưu trong
  comparison_summary.json để tránh lệch pha tiền xử lý dữ liệu
  (phát hiện và sửa một lỗi tiền xử lý trong lúc viết script: dữ
  liệu test phải chuẩn hoá về [0,1] giống lúc huấn luyện)

Co-Authored-By: Claude Sonnet 5 <noreply@anthropic.com>
Claude-Session: https://claude.ai/code/session_012MsmdJyXAipgvwuSTidUDk
</commit_message>
<xml_diff>
--- a/thesis/doc/thesis.docx
+++ b/thesis/doc/thesis.docx
@@ -1515,7 +1515,7 @@
         </w:rPr>
         <w:t>4.12. Kết quả chương trình demo</w:t>
         <w:tab/>
-        <w:t>35</w:t>
+        <w:t>36</w:t>
       </w:r>
     </w:p>
     <w:p>
@@ -1534,7 +1534,7 @@
         </w:rPr>
         <w:t>4.13. Hạn chế của chương trình demo</w:t>
         <w:tab/>
-        <w:t>36</w:t>
+        <w:t>38</w:t>
       </w:r>
     </w:p>
     <w:p>
@@ -1553,7 +1553,7 @@
         </w:rPr>
         <w:t>4.14. Thảo luận tổng hợp</w:t>
         <w:tab/>
-        <w:t>36</w:t>
+        <w:t>38</w:t>
       </w:r>
     </w:p>
     <w:p>
@@ -1562,14 +1562,15 @@
           <w:tab w:pos="9071" w:val="right" w:leader="dot"/>
         </w:tabs>
         <w:spacing w:after="80" w:before="0" w:line="240" w:lineRule="auto"/>
-      </w:pPr>
-      <w:r>
-        <w:rPr>
-          <w:rFonts w:ascii="Times New Roman" w:hAnsi="Times New Roman"/>
-          <w:b/>
-          <w:sz w:val="26"/>
-        </w:rPr>
-        <w:t>CHƯƠNG 5. KẾT LUẬN VÀ HƯỚNG PHÁT TRIỂN</w:t>
+        <w:ind w:left="397"/>
+      </w:pPr>
+      <w:r>
+        <w:rPr>
+          <w:rFonts w:ascii="Times New Roman" w:hAnsi="Times New Roman"/>
+          <w:b w:val="0"/>
+          <w:sz w:val="24"/>
+        </w:rPr>
+        <w:t>4.15. Kiểm chứng độ ổn định bằng Stratified K-Fold Cross-Validation</w:t>
         <w:tab/>
         <w:t>38</w:t>
       </w:r>
@@ -1587,9 +1588,9 @@
           <w:b/>
           <w:sz w:val="26"/>
         </w:rPr>
-        <w:t>DANH MỤC TÀI LIỆU THAM KHẢO</w:t>
+        <w:t>CHƯƠNG 5. KẾT LUẬN VÀ HƯỚNG PHÁT TRIỂN</w:t>
         <w:tab/>
-        <w:t>40</w:t>
+        <w:t>41</w:t>
       </w:r>
     </w:p>
     <w:p>
@@ -1605,9 +1606,27 @@
           <w:b/>
           <w:sz w:val="26"/>
         </w:rPr>
+        <w:t>DANH MỤC TÀI LIỆU THAM KHẢO</w:t>
+        <w:tab/>
+        <w:t>43</w:t>
+      </w:r>
+    </w:p>
+    <w:p>
+      <w:pPr>
+        <w:tabs>
+          <w:tab w:pos="9071" w:val="right" w:leader="dot"/>
+        </w:tabs>
+        <w:spacing w:after="80" w:before="0" w:line="240" w:lineRule="auto"/>
+      </w:pPr>
+      <w:r>
+        <w:rPr>
+          <w:rFonts w:ascii="Times New Roman" w:hAnsi="Times New Roman"/>
+          <w:b/>
+          <w:sz w:val="26"/>
+        </w:rPr>
         <w:t>PHỤ LỤC</w:t>
         <w:tab/>
-        <w:t>42</w:t>
+        <w:t>45</w:t>
       </w:r>
     </w:p>
     <w:p>
@@ -12683,6 +12702,178 @@
     </w:p>
     <w:p>
       <w:pPr>
+        <w:jc w:val="both"/>
+      </w:pPr>
+      <w:r>
+        <w:rPr>
+          <w:rFonts w:ascii="Times New Roman" w:hAnsi="Times New Roman"/>
+          <w:b w:val="0"/>
+          <w:i w:val="0"/>
+          <w:sz w:val="26"/>
+        </w:rPr>
+        <w:t>Trên toàn bộ 10.000 ảnh của tập test, KNN dự đoán sai 292 ảnh và SVM dự đoán sai 165 ảnh; trong đó có 121 ảnh cả hai mô hình cùng dự đoán sai (một tập con hẹp, gợi ý đây là những ảnh thật sự mơ hồ về mặt hình ảnh chứ không chỉ do điểm yếu riêng của một mô hình). Để minh hoạ trực quan, hình dưới đây trích ngẫu nhiên 12 ảnh KNN dự đoán sai thật từ tập test (nhãn thật và nhãn dự đoán của chính mô hình KNN đã huấn luyện, không dàn dựng):</w:t>
+      </w:r>
+    </w:p>
+    <w:p>
+      <w:pPr>
+        <w:jc w:val="center"/>
+      </w:pPr>
+      <w:r>
+        <w:drawing>
+          <wp:inline xmlns:a="http://schemas.openxmlformats.org/drawingml/2006/main" xmlns:pic="http://schemas.openxmlformats.org/drawingml/2006/picture">
+            <wp:extent cx="4680000" cy="3627000"/>
+            <wp:docPr id="22" name="Picture 22"/>
+            <wp:cNvGraphicFramePr>
+              <a:graphicFrameLocks noChangeAspect="1"/>
+            </wp:cNvGraphicFramePr>
+            <a:graphic>
+              <a:graphicData uri="http://schemas.openxmlformats.org/drawingml/2006/picture">
+                <pic:pic>
+                  <pic:nvPicPr>
+                    <pic:cNvPr id="0" name="error_gallery_knn.png"/>
+                    <pic:cNvPicPr/>
+                  </pic:nvPicPr>
+                  <pic:blipFill>
+                    <a:blip r:embed="rId30"/>
+                    <a:stretch>
+                      <a:fillRect/>
+                    </a:stretch>
+                  </pic:blipFill>
+                  <pic:spPr>
+                    <a:xfrm>
+                      <a:off x="0" y="0"/>
+                      <a:ext cx="4680000" cy="3627000"/>
+                    </a:xfrm>
+                    <a:prstGeom prst="rect"/>
+                  </pic:spPr>
+                </pic:pic>
+              </a:graphicData>
+            </a:graphic>
+          </wp:inline>
+        </w:drawing>
+      </w:r>
+    </w:p>
+    <w:p>
+      <w:pPr>
+        <w:jc w:val="center"/>
+      </w:pPr>
+      <w:r>
+        <w:rPr>
+          <w:rFonts w:ascii="Times New Roman" w:hAnsi="Times New Roman"/>
+          <w:i/>
+          <w:sz w:val="24"/>
+        </w:rPr>
+        <w:t>HÌNH 4.8: 12 ảnh KNN dự đoán sai thật, lấy ngẫu nhiên từ tập test</w:t>
+      </w:r>
+    </w:p>
+    <w:p>
+      <w:pPr>
+        <w:jc w:val="center"/>
+      </w:pPr>
+      <w:r>
+        <w:rPr>
+          <w:rFonts w:ascii="Times New Roman" w:hAnsi="Times New Roman"/>
+          <w:i/>
+          <w:sz w:val="22"/>
+        </w:rPr>
+        <w:t>(Nguồn: dự đoán thật của models/knn_mnist.joblib trên tập test MNIST)</w:t>
+      </w:r>
+    </w:p>
+    <w:p>
+      <w:pPr>
+        <w:jc w:val="both"/>
+      </w:pPr>
+      <w:r>
+        <w:rPr>
+          <w:rFonts w:ascii="Times New Roman" w:hAnsi="Times New Roman"/>
+          <w:b w:val="0"/>
+          <w:i w:val="0"/>
+          <w:sz w:val="26"/>
+        </w:rPr>
+        <w:t>Phần lớn các ảnh trên có nét viết tay không rõ ràng, nghiêng lệch hoặc thiếu nét đặc trưng (ví dụ số 8 viết không khép kín vòng dưới, số 3 viết liền nét giống số 5) — ngay cả mắt người cũng dễ nhầm lẫn khi nhìn thoáng qua. Tương tự, 12 ảnh SVM dự đoán sai thật:</w:t>
+      </w:r>
+    </w:p>
+    <w:p>
+      <w:pPr>
+        <w:jc w:val="center"/>
+      </w:pPr>
+      <w:r>
+        <w:drawing>
+          <wp:inline xmlns:a="http://schemas.openxmlformats.org/drawingml/2006/main" xmlns:pic="http://schemas.openxmlformats.org/drawingml/2006/picture">
+            <wp:extent cx="4680000" cy="3627000"/>
+            <wp:docPr id="23" name="Picture 23"/>
+            <wp:cNvGraphicFramePr>
+              <a:graphicFrameLocks noChangeAspect="1"/>
+            </wp:cNvGraphicFramePr>
+            <a:graphic>
+              <a:graphicData uri="http://schemas.openxmlformats.org/drawingml/2006/picture">
+                <pic:pic>
+                  <pic:nvPicPr>
+                    <pic:cNvPr id="0" name="error_gallery_svm.png"/>
+                    <pic:cNvPicPr/>
+                  </pic:nvPicPr>
+                  <pic:blipFill>
+                    <a:blip r:embed="rId31"/>
+                    <a:stretch>
+                      <a:fillRect/>
+                    </a:stretch>
+                  </pic:blipFill>
+                  <pic:spPr>
+                    <a:xfrm>
+                      <a:off x="0" y="0"/>
+                      <a:ext cx="4680000" cy="3627000"/>
+                    </a:xfrm>
+                    <a:prstGeom prst="rect"/>
+                  </pic:spPr>
+                </pic:pic>
+              </a:graphicData>
+            </a:graphic>
+          </wp:inline>
+        </w:drawing>
+      </w:r>
+    </w:p>
+    <w:p>
+      <w:pPr>
+        <w:jc w:val="center"/>
+      </w:pPr>
+      <w:r>
+        <w:rPr>
+          <w:rFonts w:ascii="Times New Roman" w:hAnsi="Times New Roman"/>
+          <w:i/>
+          <w:sz w:val="24"/>
+        </w:rPr>
+        <w:t>HÌNH 4.9: 12 ảnh SVM dự đoán sai thật, lấy ngẫu nhiên từ tập test</w:t>
+      </w:r>
+    </w:p>
+    <w:p>
+      <w:pPr>
+        <w:jc w:val="center"/>
+      </w:pPr>
+      <w:r>
+        <w:rPr>
+          <w:rFonts w:ascii="Times New Roman" w:hAnsi="Times New Roman"/>
+          <w:i/>
+          <w:sz w:val="22"/>
+        </w:rPr>
+        <w:t>(Nguồn: dự đoán thật của models/svm_mnist.joblib trên tập test MNIST)</w:t>
+      </w:r>
+    </w:p>
+    <w:p>
+      <w:pPr>
+        <w:jc w:val="both"/>
+      </w:pPr>
+      <w:r>
+        <w:rPr>
+          <w:rFonts w:ascii="Times New Roman" w:hAnsi="Times New Roman"/>
+          <w:b w:val="0"/>
+          <w:i w:val="0"/>
+          <w:sz w:val="26"/>
+        </w:rPr>
+        <w:t>Có thể quan sát cùng một xu hướng: các ảnh SVM dự đoán sai cũng chủ yếu rơi vào các cặp chữ số dễ nhầm lẫn đã nêu ở trên (4/9, 3/7, 5/6, 8/9), củng cố thêm cho nhận định rằng nguồn gốc sai số không nằm ở thuật toán mà nằm ở sự mơ hồ vốn có trong cách một số người viết tay các chữ số này.</w:t>
+      </w:r>
+    </w:p>
+    <w:p>
+      <w:pPr>
         <w:pStyle w:val="Heading2"/>
       </w:pPr>
       <w:r>
@@ -12717,7 +12908,7 @@
         <w:drawing>
           <wp:inline xmlns:a="http://schemas.openxmlformats.org/drawingml/2006/main" xmlns:pic="http://schemas.openxmlformats.org/drawingml/2006/picture">
             <wp:extent cx="4680000" cy="3290625"/>
-            <wp:docPr id="22" name="Picture 22"/>
+            <wp:docPr id="24" name="Picture 24"/>
             <wp:cNvGraphicFramePr>
               <a:graphicFrameLocks noChangeAspect="1"/>
             </wp:cNvGraphicFramePr>
@@ -12729,7 +12920,7 @@
                     <pic:cNvPicPr/>
                   </pic:nvPicPr>
                   <pic:blipFill>
-                    <a:blip r:embed="rId30"/>
+                    <a:blip r:embed="rId32"/>
                     <a:stretch>
                       <a:fillRect/>
                     </a:stretch>
@@ -12758,7 +12949,7 @@
           <w:i/>
           <w:sz w:val="24"/>
         </w:rPr>
-        <w:t>HÌNH 4.8: Giao diện demo ở trạng thái ban đầu</w:t>
+        <w:t>HÌNH 4.10: Giao diện demo ở trạng thái ban đầu</w:t>
       </w:r>
     </w:p>
     <w:p>
@@ -12796,7 +12987,7 @@
         <w:drawing>
           <wp:inline xmlns:a="http://schemas.openxmlformats.org/drawingml/2006/main" xmlns:pic="http://schemas.openxmlformats.org/drawingml/2006/picture">
             <wp:extent cx="4680000" cy="3290625"/>
-            <wp:docPr id="23" name="Picture 23"/>
+            <wp:docPr id="25" name="Picture 25"/>
             <wp:cNvGraphicFramePr>
               <a:graphicFrameLocks noChangeAspect="1"/>
             </wp:cNvGraphicFramePr>
@@ -12808,7 +12999,7 @@
                     <pic:cNvPicPr/>
                   </pic:nvPicPr>
                   <pic:blipFill>
-                    <a:blip r:embed="rId31"/>
+                    <a:blip r:embed="rId33"/>
                     <a:stretch>
                       <a:fillRect/>
                     </a:stretch>
@@ -12837,7 +13028,7 @@
           <w:i/>
           <w:sz w:val="24"/>
         </w:rPr>
-        <w:t>HÌNH 4.9: Kết quả dự đoán thật khi tải ảnh chữ số "7" từ tập kiểm thử MNIST</w:t>
+        <w:t>HÌNH 4.11: Kết quả dự đoán thật khi tải ảnh chữ số "7" từ tập kiểm thử MNIST</w:t>
       </w:r>
     </w:p>
     <w:p>
@@ -12957,6 +13148,491 @@
           <w:sz w:val="26"/>
         </w:rPr>
         <w:t>Phân tích PCA (mục 4.7) và phân tích lỗi định tính (mục 4.11) cho thấy hai nguồn thông tin độc lập (cấu trúc không gian đặc trưng và ma trận nhầm lẫn thật) đều chỉ ra cùng một nhóm chữ số khó phân biệt (4, 7, 9 và 3, 5, 8), tăng độ tin cậy cho kết luận này. Về mặt thực tiễn, lựa chọn giữa KNN và SVM nên dựa vào bối cảnh triển khai: KNN phù hợp hơn khi cần huấn luyện/cập nhật nhanh hoặc tài nguyên tính toán lúc huấn luyện hạn chế; SVM phù hợp hơn khi độ chính xác là ưu tiên hàng đầu và mô hình chỉ cần huấn luyện một lần rồi dùng lâu dài.</w:t>
+      </w:r>
+    </w:p>
+    <w:p>
+      <w:pPr>
+        <w:pStyle w:val="Heading2"/>
+      </w:pPr>
+      <w:r>
+        <w:rPr>
+          <w:rFonts w:ascii="Times New Roman" w:hAnsi="Times New Roman"/>
+          <w:b/>
+          <w:color w:val="000000"/>
+          <w:sz w:val="28"/>
+        </w:rPr>
+        <w:t>4.15. Kiểm chứng độ ổn định bằng Stratified K-Fold Cross-Validation</w:t>
+      </w:r>
+    </w:p>
+    <w:p>
+      <w:pPr>
+        <w:jc w:val="both"/>
+      </w:pPr>
+      <w:r>
+        <w:rPr>
+          <w:rFonts w:ascii="Times New Roman" w:hAnsi="Times New Roman"/>
+          <w:b w:val="0"/>
+          <w:i w:val="0"/>
+          <w:sz w:val="26"/>
+        </w:rPr>
+        <w:t>Các kết quả ở mục 4.2 được đo trên một lần chia tập huấn luyện/kiểm thử (hold-out) duy nhất, theo seed cố định (mục 2.4, 2.6). Để kiểm chứng độ chính xác đo được không phải là một may rủi của riêng lần chia dữ liệu đó, đồ án bổ sung một thực nghiệm stratified 5-fold cross-validation cho KNN (k=5) trên một tập con lấy mẫu ngẫu nhiên có phân tầng gồm 10.000 ảnh từ tập huấn luyện thật (không dùng toàn bộ 54.000 mẫu, cùng lý do tốc độ đã nêu ở mục 4.5 cho các khảo sát C/gamma của SVM trên tập con).</w:t>
+      </w:r>
+    </w:p>
+    <w:p>
+      <w:pPr>
+        <w:jc w:val="center"/>
+      </w:pPr>
+      <w:r>
+        <w:rPr>
+          <w:rFonts w:ascii="Times New Roman" w:hAnsi="Times New Roman"/>
+          <w:i/>
+          <w:sz w:val="24"/>
+        </w:rPr>
+        <w:t>BẢNG 4.11: Độ chính xác KNN (k=5) qua 5 fold (stratified 5-fold CV, tập con 10.000 mẫu)</w:t>
+      </w:r>
+    </w:p>
+    <w:tbl>
+      <w:tblPr>
+        <w:tblStyle w:val="TableGrid"/>
+        <w:tblW w:type="auto" w:w="0"/>
+        <w:jc w:val="center"/>
+        <w:tblLook w:firstColumn="1" w:firstRow="1" w:lastColumn="0" w:lastRow="0" w:noHBand="0" w:noVBand="1" w:val="04A0"/>
+      </w:tblPr>
+      <w:tblGrid>
+        <w:gridCol w:w="4535"/>
+        <w:gridCol w:w="4535"/>
+      </w:tblGrid>
+      <w:tr>
+        <w:trPr>
+          <w:cantSplit/>
+        </w:trPr>
+        <w:tc>
+          <w:tcPr>
+            <w:tcW w:type="dxa" w:w="3402"/>
+          </w:tcPr>
+          <w:p>
+            <w:pPr>
+              <w:jc w:val="center"/>
+            </w:pPr>
+            <w:r/>
+            <w:r>
+              <w:rPr>
+                <w:rFonts w:ascii="Times New Roman" w:hAnsi="Times New Roman"/>
+                <w:b/>
+                <w:i w:val="0"/>
+                <w:sz w:val="24"/>
+              </w:rPr>
+              <w:t>Fold</w:t>
+            </w:r>
+          </w:p>
+        </w:tc>
+        <w:tc>
+          <w:tcPr>
+            <w:tcW w:type="dxa" w:w="3402"/>
+          </w:tcPr>
+          <w:p>
+            <w:pPr>
+              <w:jc w:val="center"/>
+            </w:pPr>
+            <w:r/>
+            <w:r>
+              <w:rPr>
+                <w:rFonts w:ascii="Times New Roman" w:hAnsi="Times New Roman"/>
+                <w:b/>
+                <w:i w:val="0"/>
+                <w:sz w:val="24"/>
+              </w:rPr>
+              <w:t>Độ chính xác</w:t>
+            </w:r>
+          </w:p>
+        </w:tc>
+      </w:tr>
+      <w:tr>
+        <w:trPr>
+          <w:cantSplit/>
+        </w:trPr>
+        <w:tc>
+          <w:tcPr>
+            <w:tcW w:type="dxa" w:w="3402"/>
+          </w:tcPr>
+          <w:p>
+            <w:r/>
+            <w:r>
+              <w:rPr>
+                <w:rFonts w:ascii="Times New Roman" w:hAnsi="Times New Roman"/>
+                <w:b w:val="0"/>
+                <w:i w:val="0"/>
+                <w:sz w:val="24"/>
+              </w:rPr>
+              <w:t>Fold 1</w:t>
+            </w:r>
+          </w:p>
+        </w:tc>
+        <w:tc>
+          <w:tcPr>
+            <w:tcW w:type="dxa" w:w="3402"/>
+          </w:tcPr>
+          <w:p>
+            <w:pPr>
+              <w:jc w:val="center"/>
+            </w:pPr>
+            <w:r/>
+            <w:r>
+              <w:rPr>
+                <w:rFonts w:ascii="Times New Roman" w:hAnsi="Times New Roman"/>
+                <w:b w:val="0"/>
+                <w:i w:val="0"/>
+                <w:sz w:val="24"/>
+              </w:rPr>
+              <w:t>93,95%</w:t>
+            </w:r>
+          </w:p>
+        </w:tc>
+      </w:tr>
+      <w:tr>
+        <w:trPr>
+          <w:cantSplit/>
+        </w:trPr>
+        <w:tc>
+          <w:tcPr>
+            <w:tcW w:type="dxa" w:w="3402"/>
+          </w:tcPr>
+          <w:p>
+            <w:r/>
+            <w:r>
+              <w:rPr>
+                <w:rFonts w:ascii="Times New Roman" w:hAnsi="Times New Roman"/>
+                <w:b w:val="0"/>
+                <w:i w:val="0"/>
+                <w:sz w:val="24"/>
+              </w:rPr>
+              <w:t>Fold 2</w:t>
+            </w:r>
+          </w:p>
+        </w:tc>
+        <w:tc>
+          <w:tcPr>
+            <w:tcW w:type="dxa" w:w="3402"/>
+          </w:tcPr>
+          <w:p>
+            <w:pPr>
+              <w:jc w:val="center"/>
+            </w:pPr>
+            <w:r/>
+            <w:r>
+              <w:rPr>
+                <w:rFonts w:ascii="Times New Roman" w:hAnsi="Times New Roman"/>
+                <w:b w:val="0"/>
+                <w:i w:val="0"/>
+                <w:sz w:val="24"/>
+              </w:rPr>
+              <w:t>94,70%</w:t>
+            </w:r>
+          </w:p>
+        </w:tc>
+      </w:tr>
+      <w:tr>
+        <w:trPr>
+          <w:cantSplit/>
+        </w:trPr>
+        <w:tc>
+          <w:tcPr>
+            <w:tcW w:type="dxa" w:w="3402"/>
+          </w:tcPr>
+          <w:p>
+            <w:r/>
+            <w:r>
+              <w:rPr>
+                <w:rFonts w:ascii="Times New Roman" w:hAnsi="Times New Roman"/>
+                <w:b w:val="0"/>
+                <w:i w:val="0"/>
+                <w:sz w:val="24"/>
+              </w:rPr>
+              <w:t>Fold 3</w:t>
+            </w:r>
+          </w:p>
+        </w:tc>
+        <w:tc>
+          <w:tcPr>
+            <w:tcW w:type="dxa" w:w="3402"/>
+          </w:tcPr>
+          <w:p>
+            <w:pPr>
+              <w:jc w:val="center"/>
+            </w:pPr>
+            <w:r/>
+            <w:r>
+              <w:rPr>
+                <w:rFonts w:ascii="Times New Roman" w:hAnsi="Times New Roman"/>
+                <w:b w:val="0"/>
+                <w:i w:val="0"/>
+                <w:sz w:val="24"/>
+              </w:rPr>
+              <w:t>94,30%</w:t>
+            </w:r>
+          </w:p>
+        </w:tc>
+      </w:tr>
+      <w:tr>
+        <w:trPr>
+          <w:cantSplit/>
+        </w:trPr>
+        <w:tc>
+          <w:tcPr>
+            <w:tcW w:type="dxa" w:w="3402"/>
+          </w:tcPr>
+          <w:p>
+            <w:r/>
+            <w:r>
+              <w:rPr>
+                <w:rFonts w:ascii="Times New Roman" w:hAnsi="Times New Roman"/>
+                <w:b w:val="0"/>
+                <w:i w:val="0"/>
+                <w:sz w:val="24"/>
+              </w:rPr>
+              <w:t>Fold 4</w:t>
+            </w:r>
+          </w:p>
+        </w:tc>
+        <w:tc>
+          <w:tcPr>
+            <w:tcW w:type="dxa" w:w="3402"/>
+          </w:tcPr>
+          <w:p>
+            <w:pPr>
+              <w:jc w:val="center"/>
+            </w:pPr>
+            <w:r/>
+            <w:r>
+              <w:rPr>
+                <w:rFonts w:ascii="Times New Roman" w:hAnsi="Times New Roman"/>
+                <w:b w:val="0"/>
+                <w:i w:val="0"/>
+                <w:sz w:val="24"/>
+              </w:rPr>
+              <w:t>94,75%</w:t>
+            </w:r>
+          </w:p>
+        </w:tc>
+      </w:tr>
+      <w:tr>
+        <w:trPr>
+          <w:cantSplit/>
+        </w:trPr>
+        <w:tc>
+          <w:tcPr>
+            <w:tcW w:type="dxa" w:w="3402"/>
+          </w:tcPr>
+          <w:p>
+            <w:r/>
+            <w:r>
+              <w:rPr>
+                <w:rFonts w:ascii="Times New Roman" w:hAnsi="Times New Roman"/>
+                <w:b w:val="0"/>
+                <w:i w:val="0"/>
+                <w:sz w:val="24"/>
+              </w:rPr>
+              <w:t>Fold 5</w:t>
+            </w:r>
+          </w:p>
+        </w:tc>
+        <w:tc>
+          <w:tcPr>
+            <w:tcW w:type="dxa" w:w="3402"/>
+          </w:tcPr>
+          <w:p>
+            <w:pPr>
+              <w:jc w:val="center"/>
+            </w:pPr>
+            <w:r/>
+            <w:r>
+              <w:rPr>
+                <w:rFonts w:ascii="Times New Roman" w:hAnsi="Times New Roman"/>
+                <w:b w:val="0"/>
+                <w:i w:val="0"/>
+                <w:sz w:val="24"/>
+              </w:rPr>
+              <w:t>94,70%</w:t>
+            </w:r>
+          </w:p>
+        </w:tc>
+      </w:tr>
+      <w:tr>
+        <w:trPr>
+          <w:cantSplit/>
+        </w:trPr>
+        <w:tc>
+          <w:tcPr>
+            <w:tcW w:type="dxa" w:w="3402"/>
+          </w:tcPr>
+          <w:p>
+            <w:r/>
+            <w:r>
+              <w:rPr>
+                <w:rFonts w:ascii="Times New Roman" w:hAnsi="Times New Roman"/>
+                <w:b w:val="0"/>
+                <w:i w:val="0"/>
+                <w:sz w:val="24"/>
+              </w:rPr>
+              <w:t>Trung bình</w:t>
+            </w:r>
+          </w:p>
+        </w:tc>
+        <w:tc>
+          <w:tcPr>
+            <w:tcW w:type="dxa" w:w="3402"/>
+          </w:tcPr>
+          <w:p>
+            <w:pPr>
+              <w:jc w:val="center"/>
+            </w:pPr>
+            <w:r/>
+            <w:r>
+              <w:rPr>
+                <w:rFonts w:ascii="Times New Roman" w:hAnsi="Times New Roman"/>
+                <w:b w:val="0"/>
+                <w:i w:val="0"/>
+                <w:sz w:val="24"/>
+              </w:rPr>
+              <w:t>94,48%</w:t>
+            </w:r>
+          </w:p>
+        </w:tc>
+      </w:tr>
+      <w:tr>
+        <w:trPr>
+          <w:cantSplit/>
+        </w:trPr>
+        <w:tc>
+          <w:tcPr>
+            <w:tcW w:type="dxa" w:w="3402"/>
+          </w:tcPr>
+          <w:p>
+            <w:r/>
+            <w:r>
+              <w:rPr>
+                <w:rFonts w:ascii="Times New Roman" w:hAnsi="Times New Roman"/>
+                <w:b w:val="0"/>
+                <w:i w:val="0"/>
+                <w:sz w:val="24"/>
+              </w:rPr>
+              <w:t>Độ lệch chuẩn</w:t>
+            </w:r>
+          </w:p>
+        </w:tc>
+        <w:tc>
+          <w:tcPr>
+            <w:tcW w:type="dxa" w:w="3402"/>
+          </w:tcPr>
+          <w:p>
+            <w:pPr>
+              <w:jc w:val="center"/>
+            </w:pPr>
+            <w:r/>
+            <w:r>
+              <w:rPr>
+                <w:rFonts w:ascii="Times New Roman" w:hAnsi="Times New Roman"/>
+                <w:b w:val="0"/>
+                <w:i w:val="0"/>
+                <w:sz w:val="24"/>
+              </w:rPr>
+              <w:t>0,31%</w:t>
+            </w:r>
+          </w:p>
+        </w:tc>
+      </w:tr>
+    </w:tbl>
+    <w:p>
+      <w:pPr>
+        <w:jc w:val="center"/>
+      </w:pPr>
+      <w:r>
+        <w:rPr>
+          <w:rFonts w:ascii="Times New Roman" w:hAnsi="Times New Roman"/>
+          <w:i/>
+          <w:sz w:val="22"/>
+        </w:rPr>
+        <w:t>(Nguồn: scripts/kfold_and_error_analysis.py, results/kfold_cv.json)</w:t>
+      </w:r>
+    </w:p>
+    <w:p/>
+    <w:p>
+      <w:pPr>
+        <w:jc w:val="center"/>
+      </w:pPr>
+      <w:r>
+        <w:drawing>
+          <wp:inline xmlns:a="http://schemas.openxmlformats.org/drawingml/2006/main" xmlns:pic="http://schemas.openxmlformats.org/drawingml/2006/picture">
+            <wp:extent cx="4320000" cy="2592000"/>
+            <wp:docPr id="26" name="Picture 26"/>
+            <wp:cNvGraphicFramePr>
+              <a:graphicFrameLocks noChangeAspect="1"/>
+            </wp:cNvGraphicFramePr>
+            <a:graphic>
+              <a:graphicData uri="http://schemas.openxmlformats.org/drawingml/2006/picture">
+                <pic:pic>
+                  <pic:nvPicPr>
+                    <pic:cNvPr id="0" name="chart_kfold_cv.png"/>
+                    <pic:cNvPicPr/>
+                  </pic:nvPicPr>
+                  <pic:blipFill>
+                    <a:blip r:embed="rId34"/>
+                    <a:stretch>
+                      <a:fillRect/>
+                    </a:stretch>
+                  </pic:blipFill>
+                  <pic:spPr>
+                    <a:xfrm>
+                      <a:off x="0" y="0"/>
+                      <a:ext cx="4320000" cy="2592000"/>
+                    </a:xfrm>
+                    <a:prstGeom prst="rect"/>
+                  </pic:spPr>
+                </pic:pic>
+              </a:graphicData>
+            </a:graphic>
+          </wp:inline>
+        </w:drawing>
+      </w:r>
+    </w:p>
+    <w:p>
+      <w:pPr>
+        <w:jc w:val="center"/>
+      </w:pPr>
+      <w:r>
+        <w:rPr>
+          <w:rFonts w:ascii="Times New Roman" w:hAnsi="Times New Roman"/>
+          <w:i/>
+          <w:sz w:val="24"/>
+        </w:rPr>
+        <w:t>HÌNH 4.12: Biểu đồ độ chính xác KNN qua 5 fold</w:t>
+      </w:r>
+    </w:p>
+    <w:p>
+      <w:pPr>
+        <w:jc w:val="center"/>
+      </w:pPr>
+      <w:r>
+        <w:rPr>
+          <w:rFonts w:ascii="Times New Roman" w:hAnsi="Times New Roman"/>
+          <w:i/>
+          <w:sz w:val="22"/>
+        </w:rPr>
+        <w:t>(Nguồn: scripts/kfold_and_error_analysis.py, results/kfold_cv.json)</w:t>
+      </w:r>
+    </w:p>
+    <w:p>
+      <w:pPr>
+        <w:jc w:val="both"/>
+      </w:pPr>
+      <w:r>
+        <w:rPr>
+          <w:rFonts w:ascii="Times New Roman" w:hAnsi="Times New Roman"/>
+          <w:b w:val="0"/>
+          <w:i w:val="0"/>
+          <w:sz w:val="26"/>
+        </w:rPr>
+        <w:t>Độ lệch chuẩn giữa các fold chỉ 0,31% — rất nhỏ so với giá trị trung bình 94,48% — cho thấy hiệu năng của KNN trên dữ liệu MNIST thật ổn định, không phụ thuộc nhiều vào cách chia dữ liệu cụ thể. Giá trị trung bình 94,48% trên tập con 10.000 mẫu thấp hơn độ chính xác 97,08% đo được trên tập test đầy đủ ở mục 4.2 (huấn luyện trên toàn bộ 54.000 mẫu) — kết quả này nhất quán với đường cong học ở mục 4.10: KNN càng có nhiều dữ liệu huấn luyện thì độ chính xác càng cao, nên một mô hình chỉ huấn luyện trên tập con nhỏ hơn (ở đây là một phần của chính tập con 10.000 mẫu, do cơ chế k-fold luân phiên giữ lại 1/5 làm fold kiểm thử) tất yếu đạt độ chính xác thấp hơn một chút so với mô hình chính thức huấn luyện trên toàn bộ dữ liệu.</w:t>
       </w:r>
     </w:p>
     <w:p>

</xml_diff>

<commit_message>
fix: đánh số trang liên tục, không đánh số lại từ 1 ở Chương 1
- Phát hiện lỗi: python-docx clone sectPr của section trước khi tạo
  section mới, nên thuộc tính w:start="1" ở phần đầu tài liệu bị kế
  thừa sang section Chương 1 dù không chủ động gọi lại hàm set
  start -- khiến số trang in ra bị lặp lại chu kỳ 1..N thay vì đếm
  liên tục, dễ gây hiểu lầm số trang cuối cùng của tài liệu (ví dụ
  thấy "47" ở trang cuối thay vì tổng số trang thật 65)
- Sửa set_page_number_format(): nếu không truyền start, chủ động xoá
  thuộc tính w:start kế thừa thay vì bỏ qua
- Cập nhật lại toàn bộ Mục lục từ Chương 1 trở đi theo số trang in
  liên tục mới (lệch +16 so với trước, do 16 trang phần đầu)

Co-Authored-By: Claude Sonnet 5 <noreply@anthropic.com>
Claude-Session: https://claude.ai/code/session_012MsmdJyXAipgvwuSTidUDk
</commit_message>
<xml_diff>
--- a/thesis/doc/thesis.docx
+++ b/thesis/doc/thesis.docx
@@ -663,7 +663,7 @@
         </w:rPr>
         <w:t>CHƯƠNG 1. TỔNG QUAN</w:t>
         <w:tab/>
-        <w:t>1</w:t>
+        <w:t>17</w:t>
       </w:r>
     </w:p>
     <w:p>
@@ -682,7 +682,7 @@
         </w:rPr>
         <w:t>1.1. Bài toán nhận dạng chữ số viết tay</w:t>
         <w:tab/>
-        <w:t>1</w:t>
+        <w:t>17</w:t>
       </w:r>
     </w:p>
     <w:p>
@@ -701,7 +701,7 @@
         </w:rPr>
         <w:t>1.2. Bộ dữ liệu MNIST</w:t>
         <w:tab/>
-        <w:t>1</w:t>
+        <w:t>17</w:t>
       </w:r>
     </w:p>
     <w:p>
@@ -720,7 +720,7 @@
         </w:rPr>
         <w:t>1.3. Tình hình nghiên cứu: các kết quả đã công bố trên MNIST</w:t>
         <w:tab/>
-        <w:t>2</w:t>
+        <w:t>18</w:t>
       </w:r>
     </w:p>
     <w:p>
@@ -739,7 +739,7 @@
         </w:rPr>
         <w:t>1.4. Các hướng tiếp cận hiện nay</w:t>
         <w:tab/>
-        <w:t>4</w:t>
+        <w:t>20</w:t>
       </w:r>
     </w:p>
     <w:p>
@@ -758,7 +758,7 @@
         </w:rPr>
         <w:t>1.5. Phạm vi và lựa chọn của đồ án</w:t>
         <w:tab/>
-        <w:t>5</w:t>
+        <w:t>21</w:t>
       </w:r>
     </w:p>
     <w:p>
@@ -777,7 +777,7 @@
         </w:rPr>
         <w:t>1.6. Tổng kết chương</w:t>
         <w:tab/>
-        <w:t>5</w:t>
+        <w:t>21</w:t>
       </w:r>
     </w:p>
     <w:p>
@@ -795,7 +795,7 @@
         </w:rPr>
         <w:t>CHƯƠNG 2. NGHIÊN CỨU LÝ THUYẾT</w:t>
         <w:tab/>
-        <w:t>6</w:t>
+        <w:t>22</w:t>
       </w:r>
     </w:p>
     <w:p>
@@ -814,7 +814,7 @@
         </w:rPr>
         <w:t>2.1. Bài toán phân loại có giám sát</w:t>
         <w:tab/>
-        <w:t>6</w:t>
+        <w:t>22</w:t>
       </w:r>
     </w:p>
     <w:p>
@@ -833,7 +833,7 @@
         </w:rPr>
         <w:t>2.2. Thuật toán K-Nearest Neighbors</w:t>
         <w:tab/>
-        <w:t>6</w:t>
+        <w:t>22</w:t>
       </w:r>
     </w:p>
     <w:p>
@@ -852,7 +852,7 @@
         </w:rPr>
         <w:t>2.3. Support Vector Machine</w:t>
         <w:tab/>
-        <w:t>8</w:t>
+        <w:t>24</w:t>
       </w:r>
     </w:p>
     <w:p>
@@ -871,7 +871,7 @@
         </w:rPr>
         <w:t>2.3.1. Siêu phẳng phân tách và bài toán lề cực đại</w:t>
         <w:tab/>
-        <w:t>8</w:t>
+        <w:t>24</w:t>
       </w:r>
     </w:p>
     <w:p>
@@ -890,7 +890,7 @@
         </w:rPr>
         <w:t>2.3.2. Biên mềm và tham số C</w:t>
         <w:tab/>
-        <w:t>9</w:t>
+        <w:t>25</w:t>
       </w:r>
     </w:p>
     <w:p>
@@ -909,7 +909,7 @@
         </w:rPr>
         <w:t>2.3.3. Kernel trick và hàm kernel RBF</w:t>
         <w:tab/>
-        <w:t>9</w:t>
+        <w:t>25</w:t>
       </w:r>
     </w:p>
     <w:p>
@@ -928,7 +928,7 @@
         </w:rPr>
         <w:t>2.3.4. Chiến lược phân loại đa lớp</w:t>
         <w:tab/>
-        <w:t>10</w:t>
+        <w:t>26</w:t>
       </w:r>
     </w:p>
     <w:p>
@@ -947,7 +947,7 @@
         </w:rPr>
         <w:t>2.3.5. Chuẩn hoá dữ liệu và ảnh hưởng tới các mô hình dựa trên khoảng cách</w:t>
         <w:tab/>
-        <w:t>11</w:t>
+        <w:t>27</w:t>
       </w:r>
     </w:p>
     <w:p>
@@ -966,7 +966,7 @@
         </w:rPr>
         <w:t>2.4. Các độ đo đánh giá mô hình</w:t>
         <w:tab/>
-        <w:t>11</w:t>
+        <w:t>27</w:t>
       </w:r>
     </w:p>
     <w:p>
@@ -985,7 +985,7 @@
         </w:rPr>
         <w:t>2.5. Công cụ, công nghệ và phần mềm sử dụng</w:t>
         <w:tab/>
-        <w:t>13</w:t>
+        <w:t>29</w:t>
       </w:r>
     </w:p>
     <w:p>
@@ -1004,7 +1004,7 @@
         </w:rPr>
         <w:t>2.6. Phân tích độ phức tạp tính toán</w:t>
         <w:tab/>
-        <w:t>14</w:t>
+        <w:t>30</w:t>
       </w:r>
     </w:p>
     <w:p>
@@ -1023,7 +1023,7 @@
         </w:rPr>
         <w:t>2.7. Giả thiết khoa học của đồ án</w:t>
         <w:tab/>
-        <w:t>15</w:t>
+        <w:t>31</w:t>
       </w:r>
     </w:p>
     <w:p>
@@ -1042,7 +1042,7 @@
         </w:rPr>
         <w:t>2.8. Tổng kết chương</w:t>
         <w:tab/>
-        <w:t>15</w:t>
+        <w:t>31</w:t>
       </w:r>
     </w:p>
     <w:p>
@@ -1060,7 +1060,7 @@
         </w:rPr>
         <w:t>CHƯƠNG 3. HIỆN THỰC HÓA NGHIÊN CỨU</w:t>
         <w:tab/>
-        <w:t>17</w:t>
+        <w:t>33</w:t>
       </w:r>
     </w:p>
     <w:p>
@@ -1079,7 +1079,7 @@
         </w:rPr>
         <w:t>3.1. Quy trình tổng thể</w:t>
         <w:tab/>
-        <w:t>17</w:t>
+        <w:t>33</w:t>
       </w:r>
     </w:p>
     <w:p>
@@ -1098,7 +1098,7 @@
         </w:rPr>
         <w:t>3.2. Kiến trúc hệ thống và cấu trúc mã nguồn</w:t>
         <w:tab/>
-        <w:t>17</w:t>
+        <w:t>33</w:t>
       </w:r>
     </w:p>
     <w:p>
@@ -1117,7 +1117,7 @@
         </w:rPr>
         <w:t>3.3. Chuẩn bị dữ liệu</w:t>
         <w:tab/>
-        <w:t>19</w:t>
+        <w:t>35</w:t>
       </w:r>
     </w:p>
     <w:p>
@@ -1136,7 +1136,7 @@
         </w:rPr>
         <w:t>3.4. Cài đặt mô hình KNN</w:t>
         <w:tab/>
-        <w:t>19</w:t>
+        <w:t>35</w:t>
       </w:r>
     </w:p>
     <w:p>
@@ -1155,7 +1155,7 @@
         </w:rPr>
         <w:t>3.5. Cài đặt mô hình SVM</w:t>
         <w:tab/>
-        <w:t>20</w:t>
+        <w:t>36</w:t>
       </w:r>
     </w:p>
     <w:p>
@@ -1174,7 +1174,7 @@
         </w:rPr>
         <w:t>3.6. Quy trình huấn luyện và lưu kết quả</w:t>
         <w:tab/>
-        <w:t>20</w:t>
+        <w:t>36</w:t>
       </w:r>
     </w:p>
     <w:p>
@@ -1193,7 +1193,7 @@
         </w:rPr>
         <w:t>3.7. Thiết kế chương trình demo</w:t>
         <w:tab/>
-        <w:t>21</w:t>
+        <w:t>37</w:t>
       </w:r>
     </w:p>
     <w:p>
@@ -1212,7 +1212,7 @@
         </w:rPr>
         <w:t>3.8. Kiểm thử tự động</w:t>
         <w:tab/>
-        <w:t>21</w:t>
+        <w:t>37</w:t>
       </w:r>
     </w:p>
     <w:p>
@@ -1231,7 +1231,7 @@
         </w:rPr>
         <w:t>3.8.1. Một thách thức kỹ thuật thực tế đã gặp phải</w:t>
         <w:tab/>
-        <w:t>21</w:t>
+        <w:t>37</w:t>
       </w:r>
     </w:p>
     <w:p>
@@ -1250,7 +1250,7 @@
         </w:rPr>
         <w:t>3.9. Quản lý mã nguồn và quy trình làm việc</w:t>
         <w:tab/>
-        <w:t>22</w:t>
+        <w:t>38</w:t>
       </w:r>
     </w:p>
     <w:p>
@@ -1269,7 +1269,7 @@
         </w:rPr>
         <w:t>3.10. Tổng kết chương</w:t>
         <w:tab/>
-        <w:t>22</w:t>
+        <w:t>38</w:t>
       </w:r>
     </w:p>
     <w:p>
@@ -1287,7 +1287,7 @@
         </w:rPr>
         <w:t>CHƯƠNG 4. KẾT QUẢ NGHIÊN CỨU</w:t>
         <w:tab/>
-        <w:t>23</w:t>
+        <w:t>39</w:t>
       </w:r>
     </w:p>
     <w:p>
@@ -1306,7 +1306,7 @@
         </w:rPr>
         <w:t>4.1. Cách chia dữ liệu</w:t>
         <w:tab/>
-        <w:t>23</w:t>
+        <w:t>39</w:t>
       </w:r>
     </w:p>
     <w:p>
@@ -1325,7 +1325,7 @@
         </w:rPr>
         <w:t>4.2. Kết quả tổng thể trên tập test</w:t>
         <w:tab/>
-        <w:t>23</w:t>
+        <w:t>39</w:t>
       </w:r>
     </w:p>
     <w:p>
@@ -1344,7 +1344,7 @@
         </w:rPr>
         <w:t>4.3. Ảnh hưởng của tham số k lên KNN</w:t>
         <w:tab/>
-        <w:t>24</w:t>
+        <w:t>40</w:t>
       </w:r>
     </w:p>
     <w:p>
@@ -1363,7 +1363,7 @@
         </w:rPr>
         <w:t>4.4. Ảnh hưởng của độ đo khoảng cách lên KNN</w:t>
         <w:tab/>
-        <w:t>25</w:t>
+        <w:t>41</w:t>
       </w:r>
     </w:p>
     <w:p>
@@ -1382,7 +1382,7 @@
         </w:rPr>
         <w:t>4.5. Độ nhạy tham số C và gamma của SVM</w:t>
         <w:tab/>
-        <w:t>26</w:t>
+        <w:t>42</w:t>
       </w:r>
     </w:p>
     <w:p>
@@ -1401,7 +1401,7 @@
         </w:rPr>
         <w:t>4.6. Kết quả phân theo từng chữ số</w:t>
         <w:tab/>
-        <w:t>28</w:t>
+        <w:t>44</w:t>
       </w:r>
     </w:p>
     <w:p>
@@ -1420,7 +1420,7 @@
         </w:rPr>
         <w:t>4.7. Trực quan hoá không gian đặc trưng bằng PCA</w:t>
         <w:tab/>
-        <w:t>30</w:t>
+        <w:t>46</w:t>
       </w:r>
     </w:p>
     <w:p>
@@ -1439,7 +1439,7 @@
         </w:rPr>
         <w:t>4.8. So sánh thời gian huấn luyện</w:t>
         <w:tab/>
-        <w:t>31</w:t>
+        <w:t>47</w:t>
       </w:r>
     </w:p>
     <w:p>
@@ -1458,7 +1458,7 @@
         </w:rPr>
         <w:t>4.9. So sánh thời gian dự đoán (độ trễ)</w:t>
         <w:tab/>
-        <w:t>32</w:t>
+        <w:t>48</w:t>
       </w:r>
     </w:p>
     <w:p>
@@ -1477,7 +1477,7 @@
         </w:rPr>
         <w:t>4.10. Đường cong học theo kích thước tập huấn luyện</w:t>
         <w:tab/>
-        <w:t>33</w:t>
+        <w:t>49</w:t>
       </w:r>
     </w:p>
     <w:p>
@@ -1496,7 +1496,7 @@
         </w:rPr>
         <w:t>4.11. Phân tích định tính các ca lỗi</w:t>
         <w:tab/>
-        <w:t>34</w:t>
+        <w:t>50</w:t>
       </w:r>
     </w:p>
     <w:p>
@@ -1515,7 +1515,7 @@
         </w:rPr>
         <w:t>4.12. Kết quả chương trình demo</w:t>
         <w:tab/>
-        <w:t>36</w:t>
+        <w:t>52</w:t>
       </w:r>
     </w:p>
     <w:p>
@@ -1534,7 +1534,7 @@
         </w:rPr>
         <w:t>4.13. Hạn chế của chương trình demo</w:t>
         <w:tab/>
-        <w:t>38</w:t>
+        <w:t>54</w:t>
       </w:r>
     </w:p>
     <w:p>
@@ -1553,7 +1553,7 @@
         </w:rPr>
         <w:t>4.14. Thảo luận tổng hợp</w:t>
         <w:tab/>
-        <w:t>38</w:t>
+        <w:t>54</w:t>
       </w:r>
     </w:p>
     <w:p>
@@ -1572,7 +1572,7 @@
         </w:rPr>
         <w:t>4.15. Kiểm chứng độ ổn định bằng Stratified K-Fold Cross-Validation</w:t>
         <w:tab/>
-        <w:t>38</w:t>
+        <w:t>54</w:t>
       </w:r>
     </w:p>
     <w:p>
@@ -1590,7 +1590,7 @@
         </w:rPr>
         <w:t>CHƯƠNG 5. KẾT LUẬN VÀ HƯỚNG PHÁT TRIỂN</w:t>
         <w:tab/>
-        <w:t>41</w:t>
+        <w:t>57</w:t>
       </w:r>
     </w:p>
     <w:p>
@@ -1608,7 +1608,7 @@
         </w:rPr>
         <w:t>DANH MỤC TÀI LIỆU THAM KHẢO</w:t>
         <w:tab/>
-        <w:t>43</w:t>
+        <w:t>59</w:t>
       </w:r>
     </w:p>
     <w:p>
@@ -1626,7 +1626,7 @@
         </w:rPr>
         <w:t>PHỤ LỤC</w:t>
         <w:tab/>
-        <w:t>45</w:t>
+        <w:t>61</w:t>
       </w:r>
     </w:p>
     <w:p>
@@ -17166,7 +17166,7 @@
       <w:pgMar w:top="1134" w:right="1134" w:bottom="1134" w:left="1701" w:header="720" w:footer="720" w:gutter="0"/>
       <w:cols w:space="720"/>
       <w:docGrid w:linePitch="360"/>
-      <w:pgNumType w:fmt="decimal" w:start="1"/>
+      <w:pgNumType w:fmt="decimal"/>
     </w:sectPr>
   </w:body>
 </w:document>

</xml_diff>

<commit_message>
fix: chỉ đánh số trang từ Chương 1, bỏ dòng GVHD/SVTH dưới tiêu đề chương
- Bìa, tóm tắt, mục lục, mở đầu, các trang nhận xét không đánh số trang;
  Chương 1 bắt đầu từ trang 1 và đếm liên tục tới hết phụ lục
- Mục lục: các mục Mở đầu không ghi số trang, các chương cập nhật lại
  theo số trang mới
- Bỏ dòng "GVHD/SVTH" dưới tiêu đề các chương 1-4
- Sửa trang trắng thừa sau danh mục tài liệu tham khảo (ngắt trang
  chuyển sang thuộc tính page_break_before của tiêu đề Phụ lục)

Co-Authored-By: Claude Opus 5.5 <noreply@anthropic.com>
Claude-Session: https://claude.ai/code/session_012MsmdJyXAipgvwuSTidUDk
</commit_message>
<xml_diff>
--- a/thesis/doc/thesis.docx
+++ b/thesis/doc/thesis.docx
@@ -436,16 +436,6 @@
     </w:p>
     <w:p>
       <w:pPr>
-        <w:sectPr>
-          <w:pgSz w:w="11906" w:h="16838"/>
-          <w:pgMar w:top="1134" w:right="1134" w:bottom="1134" w:left="1701" w:header="720" w:footer="720" w:gutter="0"/>
-          <w:cols w:space="720"/>
-          <w:docGrid w:linePitch="360"/>
-        </w:sectPr>
-      </w:pPr>
-    </w:p>
-    <w:p>
-      <w:pPr>
         <w:pStyle w:val="Heading1"/>
         <w:jc w:val="center"/>
       </w:pPr>
@@ -549,8 +539,6 @@
           <w:sz w:val="26"/>
         </w:rPr>
         <w:t>MỞ ĐẦU</w:t>
-        <w:tab/>
-        <w:t>4</w:t>
       </w:r>
     </w:p>
     <w:p>
@@ -568,8 +556,6 @@
           <w:sz w:val="24"/>
         </w:rPr>
         <w:t>1. Lý do chọn đề tài</w:t>
-        <w:tab/>
-        <w:t>4</w:t>
       </w:r>
     </w:p>
     <w:p>
@@ -587,8 +573,6 @@
           <w:sz w:val="24"/>
         </w:rPr>
         <w:t>2. Mục tiêu nghiên cứu</w:t>
-        <w:tab/>
-        <w:t>4</w:t>
       </w:r>
     </w:p>
     <w:p>
@@ -606,8 +590,6 @@
           <w:sz w:val="24"/>
         </w:rPr>
         <w:t>3. Đối tượng và phạm vi nghiên cứu</w:t>
-        <w:tab/>
-        <w:t>5</w:t>
       </w:r>
     </w:p>
     <w:p>
@@ -625,8 +607,6 @@
           <w:sz w:val="24"/>
         </w:rPr>
         <w:t>4. Phương pháp nghiên cứu</w:t>
-        <w:tab/>
-        <w:t>6</w:t>
       </w:r>
     </w:p>
     <w:p>
@@ -644,8 +624,6 @@
           <w:sz w:val="24"/>
         </w:rPr>
         <w:t>5. Cấu trúc báo cáo</w:t>
-        <w:tab/>
-        <w:t>6</w:t>
       </w:r>
     </w:p>
     <w:p>
@@ -663,7 +641,7 @@
         </w:rPr>
         <w:t>CHƯƠNG 1. TỔNG QUAN</w:t>
         <w:tab/>
-        <w:t>17</w:t>
+        <w:t>1</w:t>
       </w:r>
     </w:p>
     <w:p>
@@ -682,7 +660,7 @@
         </w:rPr>
         <w:t>1.1. Bài toán nhận dạng chữ số viết tay</w:t>
         <w:tab/>
-        <w:t>17</w:t>
+        <w:t>1</w:t>
       </w:r>
     </w:p>
     <w:p>
@@ -701,7 +679,7 @@
         </w:rPr>
         <w:t>1.2. Bộ dữ liệu MNIST</w:t>
         <w:tab/>
-        <w:t>17</w:t>
+        <w:t>1</w:t>
       </w:r>
     </w:p>
     <w:p>
@@ -720,7 +698,7 @@
         </w:rPr>
         <w:t>1.3. Tình hình nghiên cứu: các kết quả đã công bố trên MNIST</w:t>
         <w:tab/>
-        <w:t>18</w:t>
+        <w:t>2</w:t>
       </w:r>
     </w:p>
     <w:p>
@@ -739,7 +717,7 @@
         </w:rPr>
         <w:t>1.4. Các hướng tiếp cận hiện nay</w:t>
         <w:tab/>
-        <w:t>20</w:t>
+        <w:t>4</w:t>
       </w:r>
     </w:p>
     <w:p>
@@ -758,7 +736,7 @@
         </w:rPr>
         <w:t>1.5. Phạm vi và lựa chọn của đồ án</w:t>
         <w:tab/>
-        <w:t>21</w:t>
+        <w:t>5</w:t>
       </w:r>
     </w:p>
     <w:p>
@@ -777,7 +755,7 @@
         </w:rPr>
         <w:t>1.6. Tổng kết chương</w:t>
         <w:tab/>
-        <w:t>21</w:t>
+        <w:t>5</w:t>
       </w:r>
     </w:p>
     <w:p>
@@ -795,7 +773,7 @@
         </w:rPr>
         <w:t>CHƯƠNG 2. NGHIÊN CỨU LÝ THUYẾT</w:t>
         <w:tab/>
-        <w:t>22</w:t>
+        <w:t>6</w:t>
       </w:r>
     </w:p>
     <w:p>
@@ -814,7 +792,7 @@
         </w:rPr>
         <w:t>2.1. Bài toán phân loại có giám sát</w:t>
         <w:tab/>
-        <w:t>22</w:t>
+        <w:t>6</w:t>
       </w:r>
     </w:p>
     <w:p>
@@ -833,7 +811,7 @@
         </w:rPr>
         <w:t>2.2. Thuật toán K-Nearest Neighbors</w:t>
         <w:tab/>
-        <w:t>22</w:t>
+        <w:t>6</w:t>
       </w:r>
     </w:p>
     <w:p>
@@ -852,7 +830,7 @@
         </w:rPr>
         <w:t>2.3. Support Vector Machine</w:t>
         <w:tab/>
-        <w:t>24</w:t>
+        <w:t>8</w:t>
       </w:r>
     </w:p>
     <w:p>
@@ -871,7 +849,7 @@
         </w:rPr>
         <w:t>2.3.1. Siêu phẳng phân tách và bài toán lề cực đại</w:t>
         <w:tab/>
-        <w:t>24</w:t>
+        <w:t>8</w:t>
       </w:r>
     </w:p>
     <w:p>
@@ -890,7 +868,7 @@
         </w:rPr>
         <w:t>2.3.2. Biên mềm và tham số C</w:t>
         <w:tab/>
-        <w:t>25</w:t>
+        <w:t>8</w:t>
       </w:r>
     </w:p>
     <w:p>
@@ -909,7 +887,7 @@
         </w:rPr>
         <w:t>2.3.3. Kernel trick và hàm kernel RBF</w:t>
         <w:tab/>
-        <w:t>25</w:t>
+        <w:t>9</w:t>
       </w:r>
     </w:p>
     <w:p>
@@ -928,7 +906,7 @@
         </w:rPr>
         <w:t>2.3.4. Chiến lược phân loại đa lớp</w:t>
         <w:tab/>
-        <w:t>26</w:t>
+        <w:t>10</w:t>
       </w:r>
     </w:p>
     <w:p>
@@ -947,7 +925,7 @@
         </w:rPr>
         <w:t>2.3.5. Chuẩn hoá dữ liệu và ảnh hưởng tới các mô hình dựa trên khoảng cách</w:t>
         <w:tab/>
-        <w:t>27</w:t>
+        <w:t>10</w:t>
       </w:r>
     </w:p>
     <w:p>
@@ -966,7 +944,7 @@
         </w:rPr>
         <w:t>2.4. Các độ đo đánh giá mô hình</w:t>
         <w:tab/>
-        <w:t>27</w:t>
+        <w:t>11</w:t>
       </w:r>
     </w:p>
     <w:p>
@@ -985,7 +963,7 @@
         </w:rPr>
         <w:t>2.5. Công cụ, công nghệ và phần mềm sử dụng</w:t>
         <w:tab/>
-        <w:t>29</w:t>
+        <w:t>13</w:t>
       </w:r>
     </w:p>
     <w:p>
@@ -1004,7 +982,7 @@
         </w:rPr>
         <w:t>2.6. Phân tích độ phức tạp tính toán</w:t>
         <w:tab/>
-        <w:t>30</w:t>
+        <w:t>14</w:t>
       </w:r>
     </w:p>
     <w:p>
@@ -1023,7 +1001,7 @@
         </w:rPr>
         <w:t>2.7. Giả thiết khoa học của đồ án</w:t>
         <w:tab/>
-        <w:t>31</w:t>
+        <w:t>15</w:t>
       </w:r>
     </w:p>
     <w:p>
@@ -1042,7 +1020,7 @@
         </w:rPr>
         <w:t>2.8. Tổng kết chương</w:t>
         <w:tab/>
-        <w:t>31</w:t>
+        <w:t>15</w:t>
       </w:r>
     </w:p>
     <w:p>
@@ -1060,7 +1038,7 @@
         </w:rPr>
         <w:t>CHƯƠNG 3. HIỆN THỰC HÓA NGHIÊN CỨU</w:t>
         <w:tab/>
-        <w:t>33</w:t>
+        <w:t>16</w:t>
       </w:r>
     </w:p>
     <w:p>
@@ -1079,7 +1057,7 @@
         </w:rPr>
         <w:t>3.1. Quy trình tổng thể</w:t>
         <w:tab/>
-        <w:t>33</w:t>
+        <w:t>16</w:t>
       </w:r>
     </w:p>
     <w:p>
@@ -1098,7 +1076,7 @@
         </w:rPr>
         <w:t>3.2. Kiến trúc hệ thống và cấu trúc mã nguồn</w:t>
         <w:tab/>
-        <w:t>33</w:t>
+        <w:t>16</w:t>
       </w:r>
     </w:p>
     <w:p>
@@ -1117,7 +1095,7 @@
         </w:rPr>
         <w:t>3.3. Chuẩn bị dữ liệu</w:t>
         <w:tab/>
-        <w:t>35</w:t>
+        <w:t>17</w:t>
       </w:r>
     </w:p>
     <w:p>
@@ -1136,7 +1114,7 @@
         </w:rPr>
         <w:t>3.4. Cài đặt mô hình KNN</w:t>
         <w:tab/>
-        <w:t>35</w:t>
+        <w:t>18</w:t>
       </w:r>
     </w:p>
     <w:p>
@@ -1155,7 +1133,7 @@
         </w:rPr>
         <w:t>3.5. Cài đặt mô hình SVM</w:t>
         <w:tab/>
-        <w:t>36</w:t>
+        <w:t>18</w:t>
       </w:r>
     </w:p>
     <w:p>
@@ -1174,7 +1152,7 @@
         </w:rPr>
         <w:t>3.6. Quy trình huấn luyện và lưu kết quả</w:t>
         <w:tab/>
-        <w:t>36</w:t>
+        <w:t>19</w:t>
       </w:r>
     </w:p>
     <w:p>
@@ -1193,7 +1171,7 @@
         </w:rPr>
         <w:t>3.7. Thiết kế chương trình demo</w:t>
         <w:tab/>
-        <w:t>37</w:t>
+        <w:t>19</w:t>
       </w:r>
     </w:p>
     <w:p>
@@ -1212,7 +1190,7 @@
         </w:rPr>
         <w:t>3.8. Kiểm thử tự động</w:t>
         <w:tab/>
-        <w:t>37</w:t>
+        <w:t>20</w:t>
       </w:r>
     </w:p>
     <w:p>
@@ -1231,7 +1209,7 @@
         </w:rPr>
         <w:t>3.8.1. Một thách thức kỹ thuật thực tế đã gặp phải</w:t>
         <w:tab/>
-        <w:t>37</w:t>
+        <w:t>20</w:t>
       </w:r>
     </w:p>
     <w:p>
@@ -1250,7 +1228,7 @@
         </w:rPr>
         <w:t>3.9. Quản lý mã nguồn và quy trình làm việc</w:t>
         <w:tab/>
-        <w:t>38</w:t>
+        <w:t>21</w:t>
       </w:r>
     </w:p>
     <w:p>
@@ -1269,7 +1247,7 @@
         </w:rPr>
         <w:t>3.10. Tổng kết chương</w:t>
         <w:tab/>
-        <w:t>38</w:t>
+        <w:t>21</w:t>
       </w:r>
     </w:p>
     <w:p>
@@ -1287,7 +1265,7 @@
         </w:rPr>
         <w:t>CHƯƠNG 4. KẾT QUẢ NGHIÊN CỨU</w:t>
         <w:tab/>
-        <w:t>39</w:t>
+        <w:t>22</w:t>
       </w:r>
     </w:p>
     <w:p>
@@ -1306,7 +1284,7 @@
         </w:rPr>
         <w:t>4.1. Cách chia dữ liệu</w:t>
         <w:tab/>
-        <w:t>39</w:t>
+        <w:t>22</w:t>
       </w:r>
     </w:p>
     <w:p>
@@ -1325,7 +1303,7 @@
         </w:rPr>
         <w:t>4.2. Kết quả tổng thể trên tập test</w:t>
         <w:tab/>
-        <w:t>39</w:t>
+        <w:t>22</w:t>
       </w:r>
     </w:p>
     <w:p>
@@ -1344,7 +1322,7 @@
         </w:rPr>
         <w:t>4.3. Ảnh hưởng của tham số k lên KNN</w:t>
         <w:tab/>
-        <w:t>40</w:t>
+        <w:t>23</w:t>
       </w:r>
     </w:p>
     <w:p>
@@ -1363,7 +1341,7 @@
         </w:rPr>
         <w:t>4.4. Ảnh hưởng của độ đo khoảng cách lên KNN</w:t>
         <w:tab/>
-        <w:t>41</w:t>
+        <w:t>24</w:t>
       </w:r>
     </w:p>
     <w:p>
@@ -1382,7 +1360,7 @@
         </w:rPr>
         <w:t>4.5. Độ nhạy tham số C và gamma của SVM</w:t>
         <w:tab/>
-        <w:t>42</w:t>
+        <w:t>25</w:t>
       </w:r>
     </w:p>
     <w:p>
@@ -1401,7 +1379,7 @@
         </w:rPr>
         <w:t>4.6. Kết quả phân theo từng chữ số</w:t>
         <w:tab/>
-        <w:t>44</w:t>
+        <w:t>27</w:t>
       </w:r>
     </w:p>
     <w:p>
@@ -1420,7 +1398,7 @@
         </w:rPr>
         <w:t>4.7. Trực quan hoá không gian đặc trưng bằng PCA</w:t>
         <w:tab/>
-        <w:t>46</w:t>
+        <w:t>29</w:t>
       </w:r>
     </w:p>
     <w:p>
@@ -1439,7 +1417,7 @@
         </w:rPr>
         <w:t>4.8. So sánh thời gian huấn luyện</w:t>
         <w:tab/>
-        <w:t>47</w:t>
+        <w:t>30</w:t>
       </w:r>
     </w:p>
     <w:p>
@@ -1458,7 +1436,7 @@
         </w:rPr>
         <w:t>4.9. So sánh thời gian dự đoán (độ trễ)</w:t>
         <w:tab/>
-        <w:t>48</w:t>
+        <w:t>31</w:t>
       </w:r>
     </w:p>
     <w:p>
@@ -1477,7 +1455,7 @@
         </w:rPr>
         <w:t>4.10. Đường cong học theo kích thước tập huấn luyện</w:t>
         <w:tab/>
-        <w:t>49</w:t>
+        <w:t>32</w:t>
       </w:r>
     </w:p>
     <w:p>
@@ -1496,7 +1474,7 @@
         </w:rPr>
         <w:t>4.11. Phân tích định tính các ca lỗi</w:t>
         <w:tab/>
-        <w:t>50</w:t>
+        <w:t>33</w:t>
       </w:r>
     </w:p>
     <w:p>
@@ -1515,7 +1493,7 @@
         </w:rPr>
         <w:t>4.12. Kết quả chương trình demo</w:t>
         <w:tab/>
-        <w:t>52</w:t>
+        <w:t>35</w:t>
       </w:r>
     </w:p>
     <w:p>
@@ -1534,7 +1512,7 @@
         </w:rPr>
         <w:t>4.13. Hạn chế của chương trình demo</w:t>
         <w:tab/>
-        <w:t>54</w:t>
+        <w:t>37</w:t>
       </w:r>
     </w:p>
     <w:p>
@@ -1553,7 +1531,7 @@
         </w:rPr>
         <w:t>4.14. Thảo luận tổng hợp</w:t>
         <w:tab/>
-        <w:t>54</w:t>
+        <w:t>37</w:t>
       </w:r>
     </w:p>
     <w:p>
@@ -1572,7 +1550,7 @@
         </w:rPr>
         <w:t>4.15. Kiểm chứng độ ổn định bằng Stratified K-Fold Cross-Validation</w:t>
         <w:tab/>
-        <w:t>54</w:t>
+        <w:t>37</w:t>
       </w:r>
     </w:p>
     <w:p>
@@ -1590,7 +1568,7 @@
         </w:rPr>
         <w:t>CHƯƠNG 5. KẾT LUẬN VÀ HƯỚNG PHÁT TRIỂN</w:t>
         <w:tab/>
-        <w:t>57</w:t>
+        <w:t>40</w:t>
       </w:r>
     </w:p>
     <w:p>
@@ -1608,7 +1586,7 @@
         </w:rPr>
         <w:t>DANH MỤC TÀI LIỆU THAM KHẢO</w:t>
         <w:tab/>
-        <w:t>59</w:t>
+        <w:t>42</w:t>
       </w:r>
     </w:p>
     <w:p>
@@ -1626,7 +1604,7 @@
         </w:rPr>
         <w:t>PHỤ LỤC</w:t>
         <w:tab/>
-        <w:t>61</w:t>
+        <w:t>43</w:t>
       </w:r>
     </w:p>
     <w:p>
@@ -3913,12 +3891,10 @@
     <w:p>
       <w:pPr>
         <w:sectPr>
-          <w:footerReference w:type="default" r:id="rId10"/>
           <w:pgSz w:w="11906" w:h="16838"/>
           <w:pgMar w:top="1134" w:right="1134" w:bottom="1134" w:left="1701" w:header="720" w:footer="720" w:gutter="0"/>
           <w:cols w:space="720"/>
           <w:docGrid w:linePitch="360"/>
-          <w:pgNumType w:fmt="decimal" w:start="1"/>
         </w:sectPr>
       </w:pPr>
     </w:p>
@@ -3934,19 +3910,6 @@
           <w:sz w:val="32"/>
         </w:rPr>
         <w:t>CHƯƠNG 1. TỔNG QUAN</w:t>
-      </w:r>
-    </w:p>
-    <w:p>
-      <w:pPr>
-        <w:jc w:val="center"/>
-      </w:pPr>
-      <w:r>
-        <w:rPr>
-          <w:rFonts w:ascii="Times New Roman" w:hAnsi="Times New Roman"/>
-          <w:i/>
-          <w:sz w:val="24"/>
-        </w:rPr>
-        <w:t>GVHD: ThS. Nguyễn Nhứt Lam          SVTH: Phan Thành Thuận</w:t>
       </w:r>
     </w:p>
     <w:p>
@@ -5430,19 +5393,6 @@
           <w:sz w:val="32"/>
         </w:rPr>
         <w:t>CHƯƠNG 2. NGHIÊN CỨU LÝ THUYẾT</w:t>
-      </w:r>
-    </w:p>
-    <w:p>
-      <w:pPr>
-        <w:jc w:val="center"/>
-      </w:pPr>
-      <w:r>
-        <w:rPr>
-          <w:rFonts w:ascii="Times New Roman" w:hAnsi="Times New Roman"/>
-          <w:i/>
-          <w:sz w:val="24"/>
-        </w:rPr>
-        <w:t>GVHD: ThS. Nguyễn Nhứt Lam          SVTH: Phan Thành Thuận</w:t>
       </w:r>
     </w:p>
     <w:p>
@@ -7739,19 +7689,6 @@
     </w:p>
     <w:p>
       <w:pPr>
-        <w:jc w:val="center"/>
-      </w:pPr>
-      <w:r>
-        <w:rPr>
-          <w:rFonts w:ascii="Times New Roman" w:hAnsi="Times New Roman"/>
-          <w:i/>
-          <w:sz w:val="24"/>
-        </w:rPr>
-        <w:t>GVHD: ThS. Nguyễn Nhứt Lam          SVTH: Phan Thành Thuận</w:t>
-      </w:r>
-    </w:p>
-    <w:p>
-      <w:pPr>
         <w:pStyle w:val="Heading2"/>
       </w:pPr>
       <w:r>
@@ -8600,19 +8537,6 @@
     </w:p>
     <w:p>
       <w:pPr>
-        <w:jc w:val="center"/>
-      </w:pPr>
-      <w:r>
-        <w:rPr>
-          <w:rFonts w:ascii="Times New Roman" w:hAnsi="Times New Roman"/>
-          <w:i/>
-          <w:sz w:val="24"/>
-        </w:rPr>
-        <w:t>GVHD: ThS. Nguyễn Nhứt Lam          SVTH: Phan Thành Thuận</w:t>
-      </w:r>
-    </w:p>
-    <w:p>
-      <w:pPr>
         <w:pStyle w:val="Heading2"/>
       </w:pPr>
       <w:r>
@@ -14044,13 +13968,9 @@
       </w:r>
     </w:p>
     <w:p>
-      <w:r>
-        <w:br w:type="page"/>
-      </w:r>
-    </w:p>
-    <w:p>
       <w:pPr>
         <w:pStyle w:val="Heading1"/>
+        <w:pageBreakBefore/>
         <w:jc w:val="center"/>
       </w:pPr>
       <w:r>
@@ -17162,11 +17082,12 @@
       </w:r>
     </w:p>
     <w:sectPr>
+      <w:footerReference w:type="default" r:id="rId10"/>
       <w:pgSz w:w="11906" w:h="16838"/>
       <w:pgMar w:top="1134" w:right="1134" w:bottom="1134" w:left="1701" w:header="720" w:footer="720" w:gutter="0"/>
       <w:cols w:space="720"/>
       <w:docGrid w:linePitch="360"/>
-      <w:pgNumType w:fmt="decimal"/>
+      <w:pgNumType w:fmt="decimal" w:start="1"/>
     </w:sectPr>
   </w:body>
 </w:document>

</xml_diff>

<commit_message>
feat: thêm header/footer cố định cho mọi trang trừ hai trang bìa
- Header: "Đồ án thực tập chuyên ngành" (trái) và "Nhận dạng chữ số
  viết tay" (phải), có đường kẻ dưới
- Footer: "SVTH – GVHD" (trái), có đường kẻ trên; số trang ở bên phải
  footer chỉ xuất hiện từ Chương 1
- Xoá tab stop mặc định của style Header/Footer để chữ bên phải căn
  sát lề

Co-Authored-By: Claude Opus 5.5 <noreply@anthropic.com>
Claude-Session: https://claude.ai/code/session_012MsmdJyXAipgvwuSTidUDk
</commit_message>
<xml_diff>
--- a/thesis/doc/thesis.docx
+++ b/thesis/doc/thesis.docx
@@ -430,9 +430,14 @@
       </w:r>
     </w:p>
     <w:p>
-      <w:r>
-        <w:br w:type="page"/>
-      </w:r>
+      <w:pPr>
+        <w:sectPr>
+          <w:pgSz w:w="11906" w:h="16838"/>
+          <w:pgMar w:top="1134" w:right="1134" w:bottom="1134" w:left="1701" w:header="720" w:footer="720" w:gutter="0"/>
+          <w:cols w:space="720"/>
+          <w:docGrid w:linePitch="360"/>
+        </w:sectPr>
+      </w:pPr>
     </w:p>
     <w:p>
       <w:pPr>
@@ -3891,6 +3896,8 @@
     <w:p>
       <w:pPr>
         <w:sectPr>
+          <w:headerReference w:type="default" r:id="rId10"/>
+          <w:footerReference w:type="default" r:id="rId11"/>
           <w:pgSz w:w="11906" w:h="16838"/>
           <w:pgMar w:top="1134" w:right="1134" w:bottom="1134" w:left="1701" w:header="720" w:footer="720" w:gutter="0"/>
           <w:cols w:space="720"/>
@@ -5499,7 +5506,7 @@
                     <pic:cNvPicPr/>
                   </pic:nvPicPr>
                   <pic:blipFill>
-                    <a:blip r:embed="rId11"/>
+                    <a:blip r:embed="rId13"/>
                     <a:stretch>
                       <a:fillRect/>
                     </a:stretch>
@@ -5607,7 +5614,7 @@
                     <pic:cNvPicPr/>
                   </pic:nvPicPr>
                   <pic:blipFill>
-                    <a:blip r:embed="rId12"/>
+                    <a:blip r:embed="rId14"/>
                     <a:stretch>
                       <a:fillRect/>
                     </a:stretch>
@@ -5771,7 +5778,7 @@
                     <pic:cNvPicPr/>
                   </pic:nvPicPr>
                   <pic:blipFill>
-                    <a:blip r:embed="rId13"/>
+                    <a:blip r:embed="rId15"/>
                     <a:stretch>
                       <a:fillRect/>
                     </a:stretch>
@@ -5837,7 +5844,7 @@
                     <pic:cNvPicPr/>
                   </pic:nvPicPr>
                   <pic:blipFill>
-                    <a:blip r:embed="rId14"/>
+                    <a:blip r:embed="rId16"/>
                     <a:stretch>
                       <a:fillRect/>
                     </a:stretch>
@@ -6029,7 +6036,7 @@
                     <pic:cNvPicPr/>
                   </pic:nvPicPr>
                   <pic:blipFill>
-                    <a:blip r:embed="rId15"/>
+                    <a:blip r:embed="rId17"/>
                     <a:stretch>
                       <a:fillRect/>
                     </a:stretch>
@@ -6095,7 +6102,7 @@
                     <pic:cNvPicPr/>
                   </pic:nvPicPr>
                   <pic:blipFill>
-                    <a:blip r:embed="rId16"/>
+                    <a:blip r:embed="rId18"/>
                     <a:stretch>
                       <a:fillRect/>
                     </a:stretch>
@@ -6273,7 +6280,7 @@
                     <pic:cNvPicPr/>
                   </pic:nvPicPr>
                   <pic:blipFill>
-                    <a:blip r:embed="rId17"/>
+                    <a:blip r:embed="rId19"/>
                     <a:stretch>
                       <a:fillRect/>
                     </a:stretch>
@@ -6325,7 +6332,7 @@
                     <pic:cNvPicPr/>
                   </pic:nvPicPr>
                   <pic:blipFill>
-                    <a:blip r:embed="rId18"/>
+                    <a:blip r:embed="rId20"/>
                     <a:stretch>
                       <a:fillRect/>
                     </a:stretch>
@@ -6377,7 +6384,7 @@
                     <pic:cNvPicPr/>
                   </pic:nvPicPr>
                   <pic:blipFill>
-                    <a:blip r:embed="rId19"/>
+                    <a:blip r:embed="rId21"/>
                     <a:stretch>
                       <a:fillRect/>
                     </a:stretch>
@@ -6429,7 +6436,7 @@
                     <pic:cNvPicPr/>
                   </pic:nvPicPr>
                   <pic:blipFill>
-                    <a:blip r:embed="rId20"/>
+                    <a:blip r:embed="rId22"/>
                     <a:stretch>
                       <a:fillRect/>
                     </a:stretch>
@@ -7735,7 +7742,7 @@
                     <pic:cNvPicPr/>
                   </pic:nvPicPr>
                   <pic:blipFill>
-                    <a:blip r:embed="rId21"/>
+                    <a:blip r:embed="rId23"/>
                     <a:stretch>
                       <a:fillRect/>
                     </a:stretch>
@@ -7815,7 +7822,7 @@
                     <pic:cNvPicPr/>
                   </pic:nvPicPr>
                   <pic:blipFill>
-                    <a:blip r:embed="rId22"/>
+                    <a:blip r:embed="rId24"/>
                     <a:stretch>
                       <a:fillRect/>
                     </a:stretch>
@@ -9639,7 +9646,7 @@
                     <pic:cNvPicPr/>
                   </pic:nvPicPr>
                   <pic:blipFill>
-                    <a:blip r:embed="rId23"/>
+                    <a:blip r:embed="rId25"/>
                     <a:stretch>
                       <a:fillRect/>
                     </a:stretch>
@@ -10474,7 +10481,7 @@
                     <pic:cNvPicPr/>
                   </pic:nvPicPr>
                   <pic:blipFill>
-                    <a:blip r:embed="rId24"/>
+                    <a:blip r:embed="rId26"/>
                     <a:stretch>
                       <a:fillRect/>
                     </a:stretch>
@@ -10847,7 +10854,7 @@
                     <pic:cNvPicPr/>
                   </pic:nvPicPr>
                   <pic:blipFill>
-                    <a:blip r:embed="rId25"/>
+                    <a:blip r:embed="rId27"/>
                     <a:stretch>
                       <a:fillRect/>
                     </a:stretch>
@@ -10912,7 +10919,7 @@
                     <pic:cNvPicPr/>
                   </pic:nvPicPr>
                   <pic:blipFill>
-                    <a:blip r:embed="rId26"/>
+                    <a:blip r:embed="rId28"/>
                     <a:stretch>
                       <a:fillRect/>
                     </a:stretch>
@@ -10977,7 +10984,7 @@
                     <pic:cNvPicPr/>
                   </pic:nvPicPr>
                   <pic:blipFill>
-                    <a:blip r:embed="rId27"/>
+                    <a:blip r:embed="rId29"/>
                     <a:stretch>
                       <a:fillRect/>
                     </a:stretch>
@@ -11809,7 +11816,7 @@
                     <pic:cNvPicPr/>
                   </pic:nvPicPr>
                   <pic:blipFill>
-                    <a:blip r:embed="rId28"/>
+                    <a:blip r:embed="rId30"/>
                     <a:stretch>
                       <a:fillRect/>
                     </a:stretch>
@@ -12523,7 +12530,7 @@
                     <pic:cNvPicPr/>
                   </pic:nvPicPr>
                   <pic:blipFill>
-                    <a:blip r:embed="rId29"/>
+                    <a:blip r:embed="rId31"/>
                     <a:stretch>
                       <a:fillRect/>
                     </a:stretch>
@@ -12658,7 +12665,7 @@
                     <pic:cNvPicPr/>
                   </pic:nvPicPr>
                   <pic:blipFill>
-                    <a:blip r:embed="rId30"/>
+                    <a:blip r:embed="rId32"/>
                     <a:stretch>
                       <a:fillRect/>
                     </a:stretch>
@@ -12737,7 +12744,7 @@
                     <pic:cNvPicPr/>
                   </pic:nvPicPr>
                   <pic:blipFill>
-                    <a:blip r:embed="rId31"/>
+                    <a:blip r:embed="rId33"/>
                     <a:stretch>
                       <a:fillRect/>
                     </a:stretch>
@@ -12844,7 +12851,7 @@
                     <pic:cNvPicPr/>
                   </pic:nvPicPr>
                   <pic:blipFill>
-                    <a:blip r:embed="rId32"/>
+                    <a:blip r:embed="rId34"/>
                     <a:stretch>
                       <a:fillRect/>
                     </a:stretch>
@@ -12923,7 +12930,7 @@
                     <pic:cNvPicPr/>
                   </pic:nvPicPr>
                   <pic:blipFill>
-                    <a:blip r:embed="rId33"/>
+                    <a:blip r:embed="rId35"/>
                     <a:stretch>
                       <a:fillRect/>
                     </a:stretch>
@@ -13500,7 +13507,7 @@
                     <pic:cNvPicPr/>
                   </pic:nvPicPr>
                   <pic:blipFill>
-                    <a:blip r:embed="rId34"/>
+                    <a:blip r:embed="rId36"/>
                     <a:stretch>
                       <a:fillRect/>
                     </a:stretch>
@@ -17082,7 +17089,7 @@
       </w:r>
     </w:p>
     <w:sectPr>
-      <w:footerReference w:type="default" r:id="rId10"/>
+      <w:footerReference w:type="default" r:id="rId12"/>
       <w:pgSz w:w="11906" w:h="16838"/>
       <w:pgMar w:top="1134" w:right="1134" w:bottom="1134" w:left="1701" w:header="720" w:footer="720" w:gutter="0"/>
       <w:cols w:space="720"/>
@@ -17098,8 +17105,54 @@
   <w:p>
     <w:pPr>
       <w:pStyle w:val="Footer"/>
-      <w:jc w:val="right"/>
+      <w:tabs>
+        <w:tab w:pos="4680" w:val="clear"/>
+        <w:tab w:pos="9071" w:val="right"/>
+        <w:tab w:pos="9360" w:val="clear"/>
+      </w:tabs>
+      <w:spacing w:line="240" w:lineRule="auto" w:before="0" w:after="0"/>
+      <w:pBdr>
+        <w:top w:val="single" w:sz="6" w:space="1" w:color="000000"/>
+      </w:pBdr>
     </w:pPr>
+    <w:r>
+      <w:rPr>
+        <w:rFonts w:ascii="Times New Roman" w:hAnsi="Times New Roman"/>
+        <w:i/>
+        <w:sz w:val="22"/>
+      </w:rPr>
+      <w:t>SVTH: Phan Thành Thuận – GVHD: ThS. Nguyễn Nhứt Lam</w:t>
+    </w:r>
+  </w:p>
+</w:ftr>
+</file>
+
+<file path=word/footer2.xml><?xml version="1.0" encoding="utf-8"?>
+<w:ftr xmlns:m="http://schemas.openxmlformats.org/officeDocument/2006/math" xmlns:mc="http://schemas.openxmlformats.org/markup-compatibility/2006" xmlns:mo="http://schemas.microsoft.com/office/mac/office/2008/main" xmlns:mv="urn:schemas-microsoft-com:mac:vml" xmlns:o="urn:schemas-microsoft-com:office:office" xmlns:r="http://schemas.openxmlformats.org/officeDocument/2006/relationships" xmlns:v="urn:schemas-microsoft-com:vml" xmlns:w10="urn:schemas-microsoft-com:office:word" xmlns:w14="http://schemas.microsoft.com/office/word/2010/wordml" xmlns:w="http://schemas.openxmlformats.org/wordprocessingml/2006/main" xmlns:wne="http://schemas.microsoft.com/office/word/2006/wordml" xmlns:wp14="http://schemas.microsoft.com/office/word/2010/wordprocessingDrawing" xmlns:wp="http://schemas.openxmlformats.org/drawingml/2006/wordprocessingDrawing" xmlns:wpc="http://schemas.microsoft.com/office/word/2010/wordprocessingCanvas" xmlns:wpg="http://schemas.microsoft.com/office/word/2010/wordprocessingGroup" xmlns:wpi="http://schemas.microsoft.com/office/word/2010/wordprocessingInk" xmlns:wps="http://schemas.microsoft.com/office/word/2010/wordprocessingShape" mc:Ignorable="w14 wp14">
+  <w:p>
+    <w:pPr>
+      <w:pStyle w:val="Footer"/>
+      <w:tabs>
+        <w:tab w:pos="4680" w:val="clear"/>
+        <w:tab w:pos="9071" w:val="right"/>
+        <w:tab w:pos="9360" w:val="clear"/>
+      </w:tabs>
+      <w:spacing w:line="240" w:lineRule="auto" w:before="0" w:after="0"/>
+      <w:pBdr>
+        <w:top w:val="single" w:sz="6" w:space="1" w:color="000000"/>
+      </w:pBdr>
+    </w:pPr>
+    <w:r>
+      <w:rPr>
+        <w:rFonts w:ascii="Times New Roman" w:hAnsi="Times New Roman"/>
+        <w:i/>
+        <w:sz w:val="22"/>
+      </w:rPr>
+      <w:t>SVTH: Phan Thành Thuận – GVHD: ThS. Nguyễn Nhứt Lam</w:t>
+    </w:r>
+    <w:r>
+      <w:tab/>
+    </w:r>
     <w:r>
       <w:fldChar w:fldCharType="begin"/>
       <w:instrText xml:space="preserve">PAGE</w:instrText>
@@ -17109,6 +17162,44 @@
     </w:r>
   </w:p>
 </w:ftr>
+</file>
+
+<file path=word/header1.xml><?xml version="1.0" encoding="utf-8"?>
+<w:hdr xmlns:m="http://schemas.openxmlformats.org/officeDocument/2006/math" xmlns:mc="http://schemas.openxmlformats.org/markup-compatibility/2006" xmlns:mo="http://schemas.microsoft.com/office/mac/office/2008/main" xmlns:mv="urn:schemas-microsoft-com:mac:vml" xmlns:o="urn:schemas-microsoft-com:office:office" xmlns:r="http://schemas.openxmlformats.org/officeDocument/2006/relationships" xmlns:v="urn:schemas-microsoft-com:vml" xmlns:w10="urn:schemas-microsoft-com:office:word" xmlns:w14="http://schemas.microsoft.com/office/word/2010/wordml" xmlns:w="http://schemas.openxmlformats.org/wordprocessingml/2006/main" xmlns:wne="http://schemas.microsoft.com/office/word/2006/wordml" xmlns:wp14="http://schemas.microsoft.com/office/word/2010/wordprocessingDrawing" xmlns:wp="http://schemas.openxmlformats.org/drawingml/2006/wordprocessingDrawing" xmlns:wpc="http://schemas.microsoft.com/office/word/2010/wordprocessingCanvas" xmlns:wpg="http://schemas.microsoft.com/office/word/2010/wordprocessingGroup" xmlns:wpi="http://schemas.microsoft.com/office/word/2010/wordprocessingInk" xmlns:wps="http://schemas.microsoft.com/office/word/2010/wordprocessingShape" mc:Ignorable="w14 wp14">
+  <w:p>
+    <w:pPr>
+      <w:pStyle w:val="Header"/>
+      <w:tabs>
+        <w:tab w:pos="4680" w:val="clear"/>
+        <w:tab w:pos="9071" w:val="right"/>
+        <w:tab w:pos="9360" w:val="clear"/>
+      </w:tabs>
+      <w:spacing w:line="240" w:lineRule="auto" w:before="0" w:after="0"/>
+      <w:pBdr>
+        <w:bottom w:val="single" w:sz="6" w:space="1" w:color="000000"/>
+      </w:pBdr>
+    </w:pPr>
+    <w:r>
+      <w:rPr>
+        <w:rFonts w:ascii="Times New Roman" w:hAnsi="Times New Roman"/>
+        <w:i/>
+        <w:sz w:val="22"/>
+      </w:rPr>
+      <w:t>Đồ án thực tập chuyên ngành</w:t>
+    </w:r>
+    <w:r>
+      <w:tab/>
+    </w:r>
+    <w:r>
+      <w:rPr>
+        <w:rFonts w:ascii="Times New Roman" w:hAnsi="Times New Roman"/>
+        <w:i/>
+        <w:sz w:val="22"/>
+      </w:rPr>
+      <w:t>Nhận dạng chữ số viết tay</w:t>
+    </w:r>
+  </w:p>
+</w:hdr>
 </file>
 
 <file path=word/numbering.xml><?xml version="1.0" encoding="utf-8"?>

</xml_diff>

<commit_message>
feat: đặt kết quả cạnh khung vẽ trong demo, quay lại video demo
- app.py: bố cục hai cột (layout wide) -- khung vẽ/tải ảnh bên trái,
  kết quả KNN và SVM bên phải, nên vừa vẽ xong là thấy kết quả mà
  không phải cuộn trang
- Quay lại video demo (68 giây): vẽ 2, 7, 4, 3, 0 với nét có độ
  nghiêng, độ rung và tốc độ không đều, rồi tải lên 4 ảnh test MNIST;
  cả 9 lần dự đoán đều đúng ở cả hai mô hình
- Chụp lại hai ảnh giao diện demo trong báo cáo theo bố cục mới; cập
  nhật mô tả bố cục (mục 3.7) và mô tả video (mục 4.12)

Co-Authored-By: Claude Opus 5.5 <noreply@anthropic.com>
Claude-Session: https://claude.ai/code/session_012MsmdJyXAipgvwuSTidUDk
</commit_message>
<xml_diff>
--- a/thesis/doc/thesis.docx
+++ b/thesis/doc/thesis.docx
@@ -1555,7 +1555,7 @@
         </w:rPr>
         <w:t>4.15. Kiểm chứng độ ổn định bằng Stratified K-Fold Cross-Validation</w:t>
         <w:tab/>
-        <w:t>37</w:t>
+        <w:t>38</w:t>
       </w:r>
     </w:p>
     <w:p>
@@ -8394,6 +8394,20 @@
           <w:i w:val="0"/>
           <w:sz w:val="26"/>
         </w:rPr>
+        <w:t>Giao diện chia làm hai cột: cột trái chứa khung vẽ và ô tải ảnh lên (hai tab), cột phải hiển thị ảnh 28×28 sau tiền xử lý cùng kết quả dự đoán và biểu đồ điểm tin cậy của KNN và SVM đặt cạnh nhau. Nhờ vậy người dùng vừa vẽ xong đã thấy ngay kết quả bên cạnh khung vẽ mà không phải cuộn trang.</w:t>
+      </w:r>
+    </w:p>
+    <w:p>
+      <w:pPr>
+        <w:jc w:val="both"/>
+      </w:pPr>
+      <w:r>
+        <w:rPr>
+          <w:rFonts w:ascii="Times New Roman" w:hAnsi="Times New Roman"/>
+          <w:b w:val="0"/>
+          <w:i w:val="0"/>
+          <w:sz w:val="26"/>
+        </w:rPr>
         <w:t>Canvas vẽ chữ số được cài đặt bằng `st.components.v2.component()` — thành phần inline HTML5 Canvas có sẵn của Streamlit, không phụ thuộc thư viện ngoài. Thư viện phổ biến `streamlit-drawable-canvas` ban đầu được cân nhắc nhưng loại bỏ sau khi phát hiện phiên bản mới nhất của thư viện này không tương thích với phiên bản Streamlit đang dùng (lỗi runtime `StreamlitAPIException` khi khởi tạo). Đề tài cho phép thay thế bằng công nghệ tương đương nếu giải thích được lựa chọn và bảo đảm sản phẩm chạy ổn định — lựa chọn này được kiểm chứng chạy ổn định bằng kiểm thử tự động (mục 3.8).</w:t>
       </w:r>
     </w:p>
@@ -12986,7 +13000,7 @@
           <w:i w:val="0"/>
           <w:sz w:val="26"/>
         </w:rPr>
-        <w:t>Một video demo thật (quay bằng Playwright, giả lập thao tác chuột thật để vẽ ba chữ số khác nhau và tải lên bốn ảnh test MNIST thật khác nhau, toàn bộ bảy lần dự đoán đều đúng ở cả hai mô hình) được lưu kèm theo đồ án tại `thesis/abs/demo_video.mp4`.</w:t>
+        <w:t>Một video demo dài khoảng 68 giây được lưu kèm theo đồ án tại `thesis/abs/demo_video.mp4`. Video quay trên chương trình demo đang chạy, thao tác chuột được điều khiển tự động bằng Playwright: vẽ năm chữ số 2, 7, 4, 3, 0 trên khung vẽ (nét vẽ có độ nghiêng, độ rung và tốc độ không đều như khi vẽ bằng tay) rồi tải lên bốn ảnh thật từ tập kiểm thử MNIST (0, 3, 5, 8). Cả chín lần dự đoán đều đúng ở cả KNN và SVM.</w:t>
       </w:r>
     </w:p>
     <w:p>

</xml_diff>